<commit_message>
Update itinerary with detailed transport guides and schedule changes
- Add Part 2: day-by-day transport routes (metro, taxi, walking)
- Update Jul 5: add Lishan Garden shuttle and copper chariots visit
- Update Jul 7: Shaanxi History Museum replaces Xi'an Museum
- Update Jul 9: Du Fu Cottage replaces Jinsha Museum
- Update Jul 12: dual airport routes (CTU taxi, TFU metro express)
- Refresh ticket booking list to match new attractions

Co-authored-by: mofan0920-ship-it <mofan0920-ship-it@users.noreply.github.com>
</commit_message>
<xml_diff>
--- a/广州-西安-成都亲子暑期旅行行程表.docx
+++ b/广州-西安-成都亲子暑期旅行行程表.docx
@@ -28,7 +28,7 @@
           <w:color w:val="666666"/>
           <w:sz w:val="22"/>
         </w:rPr>
-        <w:t>2025年7月4日 — 7月12日  |  优化版完整行程 + 门票预约清单</w:t>
+        <w:t>2025年7月4日—7月12日 | 完整行程 + 详细交通指南 + 门票预约清单</w:t>
       </w:r>
     </w:p>
     <w:p>
@@ -42,7 +42,7 @@
           <w:color w:val="1A477A"/>
           <w:sz w:val="36"/>
         </w:rPr>
-        <w:t>第一部分：修改优化后的完整行程表</w:t>
+        <w:t>第一部分：完整行程表（更新版）</w:t>
       </w:r>
     </w:p>
     <w:p>
@@ -61,7 +61,7 @@
     </w:p>
     <w:p>
       <w:pPr>
-        <w:spacing w:after="160"/>
+        <w:spacing w:after="80"/>
       </w:pPr>
       <w:r>
         <w:rPr>
@@ -70,7 +70,7 @@
           <w:color w:val="666666"/>
           <w:sz w:val="20"/>
         </w:rPr>
-        <w:t>抵达古都，大唐戏台初体验</w:t>
+        <w:t>抵达古都，机场至大雁塔酒店</w:t>
       </w:r>
     </w:p>
     <w:tbl>
@@ -190,7 +190,7 @@
                 <w:b w:val="0"/>
                 <w:sz w:val="20"/>
               </w:rPr>
-              <w:t>【地铁接驳】：机场搭乘地铁14号线至西安北站 → 换乘地铁4号线直达"大雁塔站"。（预留2.5小时，暑期行李托运及换乘较耗时）。</w:t>
+              <w:t>【地铁】14号线→4号线：机场西站→西安北站→大雁塔站（详见第二部分，约2小时，9元/人）</w:t>
             </w:r>
           </w:p>
         </w:tc>
@@ -225,7 +225,7 @@
                 <w:b w:val="0"/>
                 <w:sz w:val="20"/>
               </w:rPr>
-              <w:t>出站步行约700米，入住雅缦东方庭院酒店。</w:t>
+              <w:t>大雁塔站C/D出口，沿慈恩西路步行700米入住雅缦东方庭院酒店。</w:t>
             </w:r>
           </w:p>
         </w:tc>
@@ -260,7 +260,7 @@
                 <w:b w:val="0"/>
                 <w:sz w:val="20"/>
               </w:rPr>
-              <w:t>大悦城享用下午茶，回房午休，避开正午烈日。</w:t>
+              <w:t>大悦城下午茶，回房午休。</w:t>
             </w:r>
           </w:p>
         </w:tc>
@@ -295,7 +295,7 @@
                 <w:b w:val="0"/>
                 <w:sz w:val="20"/>
               </w:rPr>
-              <w:t>酒店庭院内换上轻便汉服，拍照留念。</w:t>
+              <w:t>酒店庭院换汉服拍照。</w:t>
             </w:r>
           </w:p>
         </w:tc>
@@ -330,7 +330,7 @@
                 <w:b w:val="0"/>
                 <w:sz w:val="20"/>
               </w:rPr>
-              <w:t>【地道晚餐】：长安大牌档（大悦城朝阳里店）。推荐菜：老陕葫芦鸡、金线油塔。店里是大唐戏台风格，孩子们能看木偶戏。</w:t>
+              <w:t>【晚餐】长安大牌档（大悦城店）。推荐：葫芦鸡、金线油塔。</w:t>
             </w:r>
           </w:p>
         </w:tc>
@@ -365,7 +365,7 @@
                 <w:b w:val="0"/>
                 <w:sz w:val="20"/>
               </w:rPr>
-              <w:t>步行游览大唐不夜城：欣赏大雁塔音乐喷泉，看街头互动表演。</w:t>
+              <w:t>大唐不夜城：音乐喷泉、街头表演。</w:t>
             </w:r>
           </w:p>
         </w:tc>
@@ -400,7 +400,7 @@
                 <w:b w:val="0"/>
                 <w:sz w:val="20"/>
               </w:rPr>
-              <w:t>步行回酒店休息。</w:t>
+              <w:t>步行回酒店。</w:t>
             </w:r>
           </w:p>
         </w:tc>
@@ -418,12 +418,12 @@
           <w:color w:val="2E6DA4"/>
           <w:sz w:val="28"/>
         </w:rPr>
-        <w:t>7月5日（周日）秦风研学与千古情</w:t>
+        <w:t>7月5日（周日）兵马俑、丽山园、世博园千古情</w:t>
       </w:r>
     </w:p>
     <w:p>
       <w:pPr>
-        <w:spacing w:after="160"/>
+        <w:spacing w:after="80"/>
       </w:pPr>
       <w:r>
         <w:rPr>
@@ -432,7 +432,7 @@
           <w:color w:val="666666"/>
           <w:sz w:val="20"/>
         </w:rPr>
-        <w:t>兵马俑，高效避暑，震撼演出</w:t>
+        <w:t>秦风研学，高效避暑</w:t>
       </w:r>
     </w:p>
     <w:tbl>
@@ -537,7 +537,7 @@
                 <w:b/>
                 <w:sz w:val="20"/>
               </w:rPr>
-              <w:t>08:30 - 09:40</w:t>
+              <w:t>08:30 - 10:10</w:t>
             </w:r>
           </w:p>
         </w:tc>
@@ -552,7 +552,7 @@
                 <w:b w:val="0"/>
                 <w:sz w:val="20"/>
               </w:rPr>
-              <w:t>【地铁前往】：大雁塔站搭乘地铁3号线 → 1号线 → 9号线直达"华清池站"。</w:t>
+              <w:t>地铁3→1→9号线至华清池，打车至兵马俑（约1小时40分）</w:t>
             </w:r>
           </w:p>
         </w:tc>
@@ -572,7 +572,7 @@
                 <w:b/>
                 <w:sz w:val="20"/>
               </w:rPr>
-              <w:t>09:40 - 10:00</w:t>
+              <w:t>10:10 - 12:30</w:t>
             </w:r>
           </w:p>
         </w:tc>
@@ -587,7 +587,7 @@
                 <w:b w:val="0"/>
                 <w:sz w:val="20"/>
               </w:rPr>
-              <w:t>【打车】：华清池地铁口打车（约15分钟）抵达兵马俑。</w:t>
+              <w:t>兵马俑一、二、三号坑深度研学。</w:t>
             </w:r>
           </w:p>
         </w:tc>
@@ -607,7 +607,7 @@
                 <w:b/>
                 <w:sz w:val="20"/>
               </w:rPr>
-              <w:t>10:00 - 13:00</w:t>
+              <w:t>12:30 - 13:30</w:t>
             </w:r>
           </w:p>
         </w:tc>
@@ -622,7 +622,7 @@
                 <w:b w:val="0"/>
                 <w:sz w:val="20"/>
               </w:rPr>
-              <w:t>兵马俑深度研学：重点参观一、二、三号坑和铜车马，由专业讲解员引导。</w:t>
+              <w:t>免费摆渡至丽山园：铜车马、百戏俑坑、秦陵封土（建议15元电瓶车）。</w:t>
             </w:r>
           </w:p>
         </w:tc>
@@ -642,7 +642,7 @@
                 <w:b/>
                 <w:sz w:val="20"/>
               </w:rPr>
-              <w:t>13:00 - 14:30</w:t>
+              <w:t>13:30 - 14:30</w:t>
             </w:r>
           </w:p>
         </w:tc>
@@ -657,7 +657,7 @@
                 <w:b w:val="0"/>
                 <w:sz w:val="20"/>
               </w:rPr>
-              <w:t>【地道午餐】：西安饭庄（临潼店）。推荐菜：温拌腰丝、糟肉。</w:t>
+              <w:t>【午餐】西安饭庄（临潼店）。推荐：温拌腰丝、糟肉。</w:t>
             </w:r>
           </w:p>
         </w:tc>
@@ -677,7 +677,7 @@
                 <w:b/>
                 <w:sz w:val="20"/>
               </w:rPr>
-              <w:t>14:30 - 15:30</w:t>
+              <w:t>14:30 - 15:00</w:t>
             </w:r>
           </w:p>
         </w:tc>
@@ -692,7 +692,7 @@
                 <w:b w:val="0"/>
                 <w:sz w:val="20"/>
               </w:rPr>
-              <w:t>【直达香湖湾（已优化，免去回酒店折返）】：打车或乘坐地铁直接前往香湖湾/世博园区域。临潼至香湖湾距离较近，避免了回大雁塔往返2小时的地铁劳累。</w:t>
+              <w:t>打车至西安千古情景区（约25分钟，50-60元）。</w:t>
             </w:r>
           </w:p>
         </w:tc>
@@ -712,7 +712,7 @@
                 <w:b/>
                 <w:sz w:val="20"/>
               </w:rPr>
-              <w:t>15:30 - 16:30</w:t>
+              <w:t>15:00 - 16:30</w:t>
             </w:r>
           </w:p>
         </w:tc>
@@ -727,7 +727,7 @@
                 <w:b w:val="0"/>
                 <w:sz w:val="20"/>
               </w:rPr>
-              <w:t>【避暑休整（已优化）】：在世博园内或《西安千古情》景区大厅内的空调咖啡厅/书店进行午休、喝冷饮，全家彻底放松。</w:t>
+              <w:t>世博园空调咖啡厅午休。</w:t>
             </w:r>
           </w:p>
         </w:tc>
@@ -762,7 +762,7 @@
                 <w:b w:val="0"/>
                 <w:sz w:val="20"/>
               </w:rPr>
-              <w:t>游览世博园，观赏《西安千古情》（预订18:00左右场次）：在凉爽的室内高科技剧场中感受大戏。</w:t>
+              <w:t>世博园+《西安千古情》（18:00场次）。</w:t>
             </w:r>
           </w:p>
         </w:tc>
@@ -797,7 +797,7 @@
                 <w:b w:val="0"/>
                 <w:sz w:val="20"/>
               </w:rPr>
-              <w:t>搭乘地铁3号线无缝返回大雁塔站。</w:t>
+              <w:t>地铁3号线回大雁塔站。</w:t>
             </w:r>
           </w:p>
         </w:tc>
@@ -832,7 +832,7 @@
                 <w:b w:val="0"/>
                 <w:sz w:val="20"/>
               </w:rPr>
-              <w:t>【地道晚餐】：醉长安（大雁塔店）。推荐菜：晾衣毛肚、桂花鲜果蜂蜜凉糕（解暑甜品）、妙笔生花。</w:t>
+              <w:t>【晚餐】醉长安（大雁塔店）。推荐：晾衣毛肚、蜂蜜凉糕。</w:t>
             </w:r>
           </w:p>
         </w:tc>
@@ -867,7 +867,7 @@
                 <w:b w:val="0"/>
                 <w:sz w:val="20"/>
               </w:rPr>
-              <w:t>步行回酒店休息。</w:t>
+              <w:t>步行回酒店。</w:t>
             </w:r>
           </w:p>
         </w:tc>
@@ -890,7 +890,7 @@
     </w:p>
     <w:p>
       <w:pPr>
-        <w:spacing w:after="160"/>
+        <w:spacing w:after="80"/>
       </w:pPr>
       <w:r>
         <w:rPr>
@@ -899,7 +899,7 @@
           <w:color w:val="666666"/>
           <w:sz w:val="20"/>
         </w:rPr>
-        <w:t>高铁往返，西上西下，画舫夜游</w:t>
+        <w:t>西上西下，画舫夜游</w:t>
       </w:r>
     </w:p>
     <w:tbl>
@@ -984,7 +984,7 @@
                 <w:b w:val="0"/>
                 <w:sz w:val="20"/>
               </w:rPr>
-              <w:t>酒店/外卖享用早餐。提前打包好面包、能量棒、洗净的水果和充足的矿泉水作为华山山顶的野餐。（已优化：取消外带易变质变软的肉夹馍，确保山顶饮食安全）。</w:t>
+              <w:t>早餐，打包面包/能量棒/水果/矿泉水（不带肉夹馍）。</w:t>
             </w:r>
           </w:p>
         </w:tc>
@@ -1019,7 +1019,7 @@
                 <w:b w:val="0"/>
                 <w:sz w:val="20"/>
               </w:rPr>
-              <w:t>【地铁】：大雁塔站搭乘地铁4号线直达"西安北站"。</w:t>
+              <w:t>地铁4号线：大雁塔→西安北站。</w:t>
             </w:r>
           </w:p>
         </w:tc>
@@ -1054,7 +1054,7 @@
                 <w:b w:val="0"/>
                 <w:sz w:val="20"/>
               </w:rPr>
-              <w:t>搭乘高铁前往华山北站。</w:t>
+              <w:t>高铁：西安北→华山北。</w:t>
             </w:r>
           </w:p>
         </w:tc>
@@ -1089,7 +1089,7 @@
                 <w:b w:val="0"/>
                 <w:sz w:val="20"/>
               </w:rPr>
-              <w:t>【打车】：华山北站打车（15分钟）至华山游客中心。</w:t>
+              <w:t>打车至华山游客中心。</w:t>
             </w:r>
           </w:p>
         </w:tc>
@@ -1124,7 +1124,7 @@
                 <w:b w:val="0"/>
                 <w:sz w:val="20"/>
               </w:rPr>
-              <w:t>华山之巅（西上西下路线）：乘进山大巴和西峰索道直达西峰。慢步游览西峰（莲花峰）及最高峰南峰。山顶风光绝美。在山顶享用自备的能量午餐。原路返回西峰索道下山，乘大巴返回游客中心。</w:t>
+              <w:t>西上西下：大巴→西峰索道→西峰+南峰→原路下山。</w:t>
             </w:r>
           </w:p>
         </w:tc>
@@ -1159,7 +1159,7 @@
                 <w:b w:val="0"/>
                 <w:sz w:val="20"/>
               </w:rPr>
-              <w:t>华山北站等候高铁。</w:t>
+              <w:t>打车回华山北站候高铁。</w:t>
             </w:r>
           </w:p>
         </w:tc>
@@ -1194,7 +1194,7 @@
                 <w:b w:val="0"/>
                 <w:sz w:val="20"/>
               </w:rPr>
-              <w:t>搭乘高铁返回西安北站（已优化，预留了更充足的索道排队时间）。</w:t>
+              <w:t>高铁回西安北站。</w:t>
             </w:r>
           </w:p>
         </w:tc>
@@ -1229,7 +1229,7 @@
                 <w:b w:val="0"/>
                 <w:sz w:val="20"/>
               </w:rPr>
-              <w:t>【地铁直达】：西安北站搭乘地铁4号线直达"大雁塔站"，回酒店全家洗澡换衣服，彻底卸下疲惫。</w:t>
+              <w:t>地铁4号线回大雁塔站，洗澡换衣服。</w:t>
             </w:r>
           </w:p>
         </w:tc>
@@ -1264,7 +1264,7 @@
                 <w:b w:val="0"/>
                 <w:sz w:val="20"/>
               </w:rPr>
-              <w:t>【地道晚餐】：陕九·老陕菜（大雁塔店）。推荐菜：招牌一口香臊子面、砂锅老豆腐、香酥羊排。</w:t>
+              <w:t>【晚餐】陕九·老陕菜。推荐：臊子面、老豆腐、羊排。</w:t>
             </w:r>
           </w:p>
         </w:tc>
@@ -1284,7 +1284,7 @@
                 <w:b/>
                 <w:sz w:val="20"/>
               </w:rPr>
-              <w:t>20:30 - 20:45</w:t>
+              <w:t>20:30 - 21:45</w:t>
             </w:r>
           </w:p>
         </w:tc>
@@ -1299,42 +1299,7 @@
                 <w:b w:val="0"/>
                 <w:sz w:val="20"/>
               </w:rPr>
-              <w:t>【地铁1站直达】：大雁塔站搭乘地铁4号线至"大唐芙蓉园站"。</w:t>
-            </w:r>
-          </w:p>
-        </w:tc>
-      </w:tr>
-      <w:tr>
-        <w:tc>
-          <w:tcPr>
-            <w:tcW w:type="dxa" w:w="4703"/>
-          </w:tcPr>
-          <w:p>
-            <w:pPr>
-              <w:jc w:val="center"/>
-            </w:pPr>
-            <w:r>
-              <w:rPr>
-                <w:rFonts w:ascii="微软雅黑" w:hAnsi="微软雅黑" w:eastAsia="微软雅黑"/>
-                <w:b/>
-                <w:sz w:val="20"/>
-              </w:rPr>
-              <w:t>20:45 - 21:45</w:t>
-            </w:r>
-          </w:p>
-        </w:tc>
-        <w:tc>
-          <w:tcPr>
-            <w:tcW w:type="dxa" w:w="4703"/>
-          </w:tcPr>
-          <w:p>
-            <w:r>
-              <w:rPr>
-                <w:rFonts w:ascii="微软雅黑" w:hAnsi="微软雅黑" w:eastAsia="微软雅黑"/>
-                <w:b w:val="0"/>
-                <w:sz w:val="20"/>
-              </w:rPr>
-              <w:t>大唐芙蓉园·芙蓉湖画舫夜游：登上有冷气的唐风画舫船，泛舟湖上，在水上观赏紫云楼灯火和水幕秀，放松双腿。</w:t>
+              <w:t>大唐芙蓉园画舫夜游（有冷气）。</w:t>
             </w:r>
           </w:p>
         </w:tc>
@@ -1369,7 +1334,7 @@
                 <w:b w:val="0"/>
                 <w:sz w:val="20"/>
               </w:rPr>
-              <w:t>搭乘地铁4号线返回大雁塔站，回酒店。</w:t>
+              <w:t>地铁回酒店。</w:t>
             </w:r>
           </w:p>
         </w:tc>
@@ -1387,12 +1352,12 @@
           <w:color w:val="2E6DA4"/>
           <w:sz w:val="28"/>
         </w:rPr>
-        <w:t>7月7日（周二）慢行历史与城墙夕阳</w:t>
+        <w:t>7月7日（周二）陕历博、大皮院、城墙</w:t>
       </w:r>
     </w:p>
     <w:p>
       <w:pPr>
-        <w:spacing w:after="160"/>
+        <w:spacing w:after="80"/>
       </w:pPr>
       <w:r>
         <w:rPr>
@@ -1401,7 +1366,7 @@
           <w:color w:val="666666"/>
           <w:sz w:val="20"/>
         </w:rPr>
-        <w:t>园林皮影，城墙晚风</w:t>
+        <w:t>历史博物馆，城墙晚风</w:t>
       </w:r>
     </w:p>
     <w:tbl>
@@ -1486,7 +1451,7 @@
                 <w:b w:val="0"/>
                 <w:sz w:val="20"/>
               </w:rPr>
-              <w:t>酒店慢起，享用早餐。</w:t>
+              <w:t>酒店早餐。</w:t>
             </w:r>
           </w:p>
         </w:tc>
@@ -1521,7 +1486,7 @@
                 <w:b w:val="0"/>
                 <w:sz w:val="20"/>
               </w:rPr>
-              <w:t>西安博物院（小雁塔内）：地铁3号线至小寨站，转2号线直达"南稍门站"。在树荫密布的小雁塔园林里散步，在博物院内吹冷气，看陕西民间皮影戏。</w:t>
+              <w:t>陕西历史博物馆（打车5分钟）。</w:t>
             </w:r>
           </w:p>
         </w:tc>
@@ -1556,7 +1521,7 @@
                 <w:b w:val="0"/>
                 <w:sz w:val="20"/>
               </w:rPr>
-              <w:t>【地道午餐】：志亮灌汤蒸饺（大皮院店）。交通优化：从南稍门站坐2号线至钟楼站，转6号线坐1站至广济街站，出站步行进入大皮院。推荐菜：牛肉灌汤蒸饺、八宝玫瑰镜糕。</w:t>
+              <w:t>【午餐】志亮灌汤蒸饺（大皮院）。地铁2→6号线至广济街。</w:t>
             </w:r>
           </w:p>
         </w:tc>
@@ -1591,7 +1556,7 @@
                 <w:b w:val="0"/>
                 <w:sz w:val="20"/>
               </w:rPr>
-              <w:t>乘地铁返回酒店午休，避开正午烈日。</w:t>
+              <w:t>回酒店午休。</w:t>
             </w:r>
           </w:p>
         </w:tc>
@@ -1626,7 +1591,7 @@
                 <w:b w:val="0"/>
                 <w:sz w:val="20"/>
               </w:rPr>
-              <w:t>西安古城墙（永宁门南门）：体验优化：大雁塔站坐地铁4号线到东门/和平门，或地铁换乘至"永宁门站"。因城墙景区规定12岁以下儿童不能骑行自行车，且路面颠簸，建议改为步行观赏日落或搭乘景区电瓶车游览，更安全省力。</w:t>
+              <w:t>西安城墙永宁门（地铁3→2号线，步行或电瓶车）。</w:t>
             </w:r>
           </w:p>
         </w:tc>
@@ -1661,7 +1626,7 @@
                 <w:b w:val="0"/>
                 <w:sz w:val="20"/>
               </w:rPr>
-              <w:t>【地道晚餐】：西安饭庄（南门里店）。推荐菜：芝麻里脊、金牌葫芦鸡。</w:t>
+              <w:t>【晚餐】西安饭庄（南门里店）。</w:t>
             </w:r>
           </w:p>
         </w:tc>
@@ -1696,7 +1661,7 @@
                 <w:b w:val="0"/>
                 <w:sz w:val="20"/>
               </w:rPr>
-              <w:t>地铁返回酒店，收拾行李。</w:t>
+              <w:t>回酒店收拾行李。</w:t>
             </w:r>
           </w:p>
         </w:tc>
@@ -1719,7 +1684,7 @@
     </w:p>
     <w:p>
       <w:pPr>
-        <w:spacing w:after="160"/>
+        <w:spacing w:after="80"/>
       </w:pPr>
       <w:r>
         <w:rPr>
@@ -1728,7 +1693,7 @@
           <w:color w:val="666666"/>
           <w:sz w:val="20"/>
         </w:rPr>
-        <w:t>移师蜀地，老茶馆与锦江画舫夜游</w:t>
+        <w:t>老茶馆与锦江夜游</w:t>
       </w:r>
     </w:p>
     <w:tbl>
@@ -1813,7 +1778,7 @@
                 <w:b w:val="0"/>
                 <w:sz w:val="20"/>
               </w:rPr>
-              <w:t>办理退房。</w:t>
+              <w:t>退房。</w:t>
             </w:r>
           </w:p>
         </w:tc>
@@ -1848,7 +1813,7 @@
                 <w:b w:val="0"/>
                 <w:sz w:val="20"/>
               </w:rPr>
-              <w:t>【地铁直达】：大雁塔站乘地铁4号线直达西安北站。</w:t>
+              <w:t>地铁4号线至西安北站。</w:t>
             </w:r>
           </w:p>
         </w:tc>
@@ -1883,7 +1848,7 @@
                 <w:b w:val="0"/>
                 <w:sz w:val="20"/>
               </w:rPr>
-              <w:t>乘坐西成高铁前往成都东站。</w:t>
+              <w:t>西成高铁至成都东。</w:t>
             </w:r>
           </w:p>
         </w:tc>
@@ -1918,42 +1883,7 @@
                 <w:b w:val="0"/>
                 <w:sz w:val="20"/>
               </w:rPr>
-              <w:t>【地铁直达】：成都东站搭乘地铁2号线直达"通惠门站"。</w:t>
-            </w:r>
-          </w:p>
-        </w:tc>
-      </w:tr>
-      <w:tr>
-        <w:tc>
-          <w:tcPr>
-            <w:tcW w:type="dxa" w:w="4703"/>
-          </w:tcPr>
-          <w:p>
-            <w:pPr>
-              <w:jc w:val="center"/>
-            </w:pPr>
-            <w:r>
-              <w:rPr>
-                <w:rFonts w:ascii="微软雅黑" w:hAnsi="微软雅黑" w:eastAsia="微软雅黑"/>
-                <w:b/>
-                <w:sz w:val="20"/>
-              </w:rPr>
-              <w:t>14:45 - 15:00</w:t>
-            </w:r>
-          </w:p>
-        </w:tc>
-        <w:tc>
-          <w:tcPr>
-            <w:tcW w:type="dxa" w:w="4703"/>
-          </w:tcPr>
-          <w:p>
-            <w:r>
-              <w:rPr>
-                <w:rFonts w:ascii="微软雅黑" w:hAnsi="微软雅黑" w:eastAsia="微软雅黑"/>
-                <w:b w:val="0"/>
-                <w:sz w:val="20"/>
-              </w:rPr>
-              <w:t>步行抵达成都宽窄巷子戴斯精选温德姆酒店。</w:t>
+              <w:t>地铁2号线至通惠门站，步行至温德姆酒店。</w:t>
             </w:r>
           </w:p>
         </w:tc>
@@ -1988,7 +1918,7 @@
                 <w:b w:val="0"/>
                 <w:sz w:val="20"/>
               </w:rPr>
-              <w:t>房间内午休、整理衣物。</w:t>
+              <w:t>午休。</w:t>
             </w:r>
           </w:p>
         </w:tc>
@@ -2023,7 +1953,7 @@
                 <w:b w:val="0"/>
                 <w:sz w:val="20"/>
               </w:rPr>
-              <w:t>人民公园 鹤鸣茶社：从酒店步行即可（约800米）。在老茶馆里点一碗竹叶青，体验"采耳"，给孩子们吃蛋烘糕。</w:t>
+              <w:t>人民公园鹤鸣茶社（步行）：竹叶青、采耳、蛋烘糕。</w:t>
             </w:r>
           </w:p>
         </w:tc>
@@ -2058,7 +1988,7 @@
                 <w:b w:val="0"/>
                 <w:sz w:val="20"/>
               </w:rPr>
-              <w:t>【地道晚餐】：饕林餐厅（奎星楼店）。推荐菜：饕林锅巴肉片（不辣）、传统回锅肉。</w:t>
+              <w:t>【晚餐】饕林餐厅（奎星楼店）。</w:t>
             </w:r>
           </w:p>
         </w:tc>
@@ -2078,7 +2008,7 @@
                 <w:b/>
                 <w:sz w:val="20"/>
               </w:rPr>
-              <w:t>19:30 - 20:00</w:t>
+              <w:t>19:30 - 21:00</w:t>
             </w:r>
           </w:p>
         </w:tc>
@@ -2093,42 +2023,7 @@
                 <w:b w:val="0"/>
                 <w:sz w:val="20"/>
               </w:rPr>
-              <w:t>【地铁直达】：通惠门站搭乘地铁2号线直达"东门大桥站"，出站步行至东门码头。</w:t>
-            </w:r>
-          </w:p>
-        </w:tc>
-      </w:tr>
-      <w:tr>
-        <w:tc>
-          <w:tcPr>
-            <w:tcW w:type="dxa" w:w="4703"/>
-          </w:tcPr>
-          <w:p>
-            <w:pPr>
-              <w:jc w:val="center"/>
-            </w:pPr>
-            <w:r>
-              <w:rPr>
-                <w:rFonts w:ascii="微软雅黑" w:hAnsi="微软雅黑" w:eastAsia="微软雅黑"/>
-                <w:b/>
-                <w:sz w:val="20"/>
-              </w:rPr>
-              <w:t>20:00 - 21:00</w:t>
-            </w:r>
-          </w:p>
-        </w:tc>
-        <w:tc>
-          <w:tcPr>
-            <w:tcW w:type="dxa" w:w="4703"/>
-          </w:tcPr>
-          <w:p>
-            <w:r>
-              <w:rPr>
-                <w:rFonts w:ascii="微软雅黑" w:hAnsi="微软雅黑" w:eastAsia="微软雅黑"/>
-                <w:b w:val="0"/>
-                <w:sz w:val="20"/>
-              </w:rPr>
-              <w:t>夜游锦江（东门码头登船）：乘画舫游船夜游锦江。两岸流光溢彩，与古风NPC演员互动吟诗，集印章。</w:t>
+              <w:t>地铁至东门大桥，夜游锦江（东门码头）。</w:t>
             </w:r>
           </w:p>
         </w:tc>
@@ -2163,7 +2058,7 @@
                 <w:b w:val="0"/>
                 <w:sz w:val="20"/>
               </w:rPr>
-              <w:t>搭乘地铁2号线返回通惠门站，回酒店。</w:t>
+              <w:t>地铁回酒店。</w:t>
             </w:r>
           </w:p>
         </w:tc>
@@ -2181,12 +2076,12 @@
           <w:color w:val="2E6DA4"/>
           <w:sz w:val="28"/>
         </w:rPr>
-        <w:t>7月9日（周四）萌翻大熊猫与金沙古蜀</w:t>
+        <w:t>7月9日（周四）大熊猫、杜甫草堂、文殊坊</w:t>
       </w:r>
     </w:p>
     <w:p>
       <w:pPr>
-        <w:spacing w:after="160"/>
+        <w:spacing w:after="80"/>
       </w:pPr>
       <w:r>
         <w:rPr>
@@ -2195,7 +2090,7 @@
           <w:color w:val="666666"/>
           <w:sz w:val="20"/>
         </w:rPr>
-        <w:t>熊猫基地，金沙追光，国潮大秀《花重锦官城》</w:t>
+        <w:t>萌熊猫，诗圣草堂，国潮大秀</w:t>
       </w:r>
     </w:p>
     <w:tbl>
@@ -2280,7 +2175,7 @@
                 <w:b w:val="0"/>
                 <w:sz w:val="20"/>
               </w:rPr>
-              <w:t>【交通优化】：直接打车/网约车直达大熊猫基地南门（车程约35分钟，车费约40-50元）。早晨打车能让全家多睡会儿，并能确保在最凉爽、熊猫最活泼的清晨黄金时间入园。</w:t>
+              <w:t>打车至熊猫基地南门（35分钟，45-50元）。</w:t>
             </w:r>
           </w:p>
         </w:tc>
@@ -2315,7 +2210,7 @@
                 <w:b w:val="0"/>
                 <w:sz w:val="20"/>
               </w:rPr>
-              <w:t>大熊猫基地：乘观光车直达山顶，看晨间最活泼的大熊猫（包括明星"花花"），避开正午高温。</w:t>
+              <w:t>熊猫基地晨间游览（含花花）。</w:t>
             </w:r>
           </w:p>
         </w:tc>
@@ -2350,7 +2245,7 @@
                 <w:b w:val="0"/>
                 <w:sz w:val="20"/>
               </w:rPr>
-              <w:t>【地道午餐】：盘飧市（春熙路店）。打车或地铁前往（地铁3号线至春熙路站），中华老字号。推荐菜：招牌卤肉拼盘、叉烧包。</w:t>
+              <w:t>【午餐】盘飧市（春熙路店）。</w:t>
             </w:r>
           </w:p>
         </w:tc>
@@ -2385,7 +2280,7 @@
                 <w:b w:val="0"/>
                 <w:sz w:val="20"/>
               </w:rPr>
-              <w:t>返回酒店午休，避开酷暑。</w:t>
+              <w:t>地铁2号线回酒店午休。</w:t>
             </w:r>
           </w:p>
         </w:tc>
@@ -2405,7 +2300,7 @@
                 <w:b/>
                 <w:sz w:val="20"/>
               </w:rPr>
-              <w:t>14:30 - 17:30</w:t>
+              <w:t>14:30 - 16:30</w:t>
             </w:r>
           </w:p>
         </w:tc>
@@ -2420,7 +2315,7 @@
                 <w:b w:val="0"/>
                 <w:sz w:val="20"/>
               </w:rPr>
-              <w:t>金沙遗址博物馆：地铁路线优化：直接从酒店外的通惠门站乘坐地铁2号线，坐4站至"一品天下站"，换乘7号线坐1站直达"金沙遗址博物馆站"。吹冷气观赏3000年前的"太阳神鸟"金饰。</w:t>
+              <w:t>杜甫草堂博物馆（打车10分钟）。</w:t>
             </w:r>
           </w:p>
         </w:tc>
@@ -2440,7 +2335,7 @@
                 <w:b/>
                 <w:sz w:val="20"/>
               </w:rPr>
-              <w:t>17:30 - 18:30</w:t>
+              <w:t>16:30 - 18:30</w:t>
             </w:r>
           </w:p>
         </w:tc>
@@ -2455,7 +2350,7 @@
                 <w:b w:val="0"/>
                 <w:sz w:val="20"/>
               </w:rPr>
-              <w:t>【特色小吃（已优化）】：洞子口张老二凉粉（文殊院总店）。体验优化：该店环境较为拥挤简陋，建议仅在此品尝甜水面（微甜微辣）和凉粉作为特色下午茶，不作为正式晚餐。</w:t>
+              <w:t>地铁4→1号线至文殊院，洞子口张老二凉粉（下午茶）。</w:t>
             </w:r>
           </w:p>
         </w:tc>
@@ -2490,7 +2385,7 @@
                 <w:b w:val="0"/>
                 <w:sz w:val="20"/>
               </w:rPr>
-              <w:t>【舒适晚餐（新增）】：在文殊坊街区内选择一家冷气足、有座位的舒适川菜馆（如：巴国布衣或同档次餐厅）享用晚餐。</w:t>
+              <w:t>文殊坊舒适川菜馆晚餐。</w:t>
             </w:r>
           </w:p>
         </w:tc>
@@ -2525,7 +2420,7 @@
                 <w:b w:val="0"/>
                 <w:sz w:val="20"/>
               </w:rPr>
-              <w:t>观赏《花重锦官城》赛博国潮大秀（文殊坊妙剧场）：5D、全息和特技结合，特别适合孩子。</w:t>
+              <w:t>《花重锦官城》大秀（妙剧场）。</w:t>
             </w:r>
           </w:p>
         </w:tc>
@@ -2560,7 +2455,7 @@
                 <w:b w:val="0"/>
                 <w:sz w:val="20"/>
               </w:rPr>
-              <w:t>文殊院站搭乘地铁1号线 → 天府广场换乘2号线回酒店休息。</w:t>
+              <w:t>地铁回酒店。</w:t>
             </w:r>
           </w:p>
         </w:tc>
@@ -2583,7 +2478,7 @@
     </w:p>
     <w:p>
       <w:pPr>
-        <w:spacing w:after="160"/>
+        <w:spacing w:after="80"/>
       </w:pPr>
       <w:r>
         <w:rPr>
@@ -2592,7 +2487,7 @@
           <w:color w:val="666666"/>
           <w:sz w:val="20"/>
         </w:rPr>
-        <w:t>寻觅古蜀，漫步太古里</w:t>
+        <w:t>古蜀文明，太古里</w:t>
       </w:r>
     </w:p>
     <w:tbl>
@@ -2677,7 +2572,7 @@
                 <w:b w:val="0"/>
                 <w:sz w:val="20"/>
               </w:rPr>
-              <w:t>酒店早餐。</w:t>
+              <w:t>早餐。</w:t>
             </w:r>
           </w:p>
         </w:tc>
@@ -2697,7 +2592,7 @@
                 <w:b/>
                 <w:sz w:val="20"/>
               </w:rPr>
-              <w:t>09:30 - 10:15</w:t>
+              <w:t>09:30 - 11:00</w:t>
             </w:r>
           </w:p>
         </w:tc>
@@ -2712,77 +2607,7 @@
                 <w:b w:val="0"/>
                 <w:sz w:val="20"/>
               </w:rPr>
-              <w:t>【地铁】：通惠门站乘地铁2号线直达"成都东站"。</w:t>
-            </w:r>
-          </w:p>
-        </w:tc>
-      </w:tr>
-      <w:tr>
-        <w:tc>
-          <w:tcPr>
-            <w:tcW w:type="dxa" w:w="4703"/>
-          </w:tcPr>
-          <w:p>
-            <w:pPr>
-              <w:jc w:val="center"/>
-            </w:pPr>
-            <w:r>
-              <w:rPr>
-                <w:rFonts w:ascii="微软雅黑" w:hAnsi="微软雅黑" w:eastAsia="微软雅黑"/>
-                <w:b/>
-                <w:sz w:val="20"/>
-              </w:rPr>
-              <w:t>10:30 - 11:00</w:t>
-            </w:r>
-          </w:p>
-        </w:tc>
-        <w:tc>
-          <w:tcPr>
-            <w:tcW w:type="dxa" w:w="4703"/>
-          </w:tcPr>
-          <w:p>
-            <w:r>
-              <w:rPr>
-                <w:rFonts w:ascii="微软雅黑" w:hAnsi="微软雅黑" w:eastAsia="微软雅黑"/>
-                <w:b w:val="0"/>
-                <w:sz w:val="20"/>
-              </w:rPr>
-              <w:t>搭乘城际高铁（成都东 → 广汉北，车程18分钟）。</w:t>
-            </w:r>
-          </w:p>
-        </w:tc>
-      </w:tr>
-      <w:tr>
-        <w:tc>
-          <w:tcPr>
-            <w:tcW w:type="dxa" w:w="4703"/>
-          </w:tcPr>
-          <w:p>
-            <w:pPr>
-              <w:jc w:val="center"/>
-            </w:pPr>
-            <w:r>
-              <w:rPr>
-                <w:rFonts w:ascii="微软雅黑" w:hAnsi="微软雅黑" w:eastAsia="微软雅黑"/>
-                <w:b/>
-                <w:sz w:val="20"/>
-              </w:rPr>
-              <w:t>11:00 - 11:20</w:t>
-            </w:r>
-          </w:p>
-        </w:tc>
-        <w:tc>
-          <w:tcPr>
-            <w:tcW w:type="dxa" w:w="4703"/>
-          </w:tcPr>
-          <w:p>
-            <w:r>
-              <w:rPr>
-                <w:rFonts w:ascii="微软雅黑" w:hAnsi="微软雅黑" w:eastAsia="微软雅黑"/>
-                <w:b w:val="0"/>
-                <w:sz w:val="20"/>
-              </w:rPr>
-              <w:t>【打车】：广汉北站打车（15分钟）直达三星堆博物馆。</w:t>
+              <w:t>地铁2号线→成都东→广汉北→打车至三星堆。</w:t>
             </w:r>
           </w:p>
         </w:tc>
@@ -2817,7 +2642,7 @@
                 <w:b w:val="0"/>
                 <w:sz w:val="20"/>
               </w:rPr>
-              <w:t>三星堆新馆深度游：戴上AR眼镜观赏青铜神树与黄金面具，中午在馆内文创咖啡厅简餐。</w:t>
+              <w:t>三星堆新馆深度游，馆内简餐。</w:t>
             </w:r>
           </w:p>
         </w:tc>
@@ -2852,7 +2677,7 @@
                 <w:b w:val="0"/>
                 <w:sz w:val="20"/>
               </w:rPr>
-              <w:t>原路乘高铁/地铁返回温德姆酒店。</w:t>
+              <w:t>返回酒店。</w:t>
             </w:r>
           </w:p>
         </w:tc>
@@ -2887,7 +2712,7 @@
                 <w:b w:val="0"/>
                 <w:sz w:val="20"/>
               </w:rPr>
-              <w:t>酒店休息，放松体能。</w:t>
+              <w:t>休息。</w:t>
             </w:r>
           </w:p>
         </w:tc>
@@ -2922,7 +2747,7 @@
                 <w:b w:val="0"/>
                 <w:sz w:val="20"/>
               </w:rPr>
-              <w:t>【地道晚餐】：柴门饭儿（太古里店）。推荐菜：蒜香排骨、柴门樱桃肉。</w:t>
+              <w:t>【晚餐】柴门饭儿（太古里店）。</w:t>
             </w:r>
           </w:p>
         </w:tc>
@@ -2957,7 +2782,7 @@
                 <w:b w:val="0"/>
                 <w:sz w:val="20"/>
               </w:rPr>
-              <w:t>漫步太古里，和IFS大熊猫合影，逛方所书店。</w:t>
+              <w:t>太古里、IFS大熊猫。</w:t>
             </w:r>
           </w:p>
         </w:tc>
@@ -2992,7 +2817,7 @@
                 <w:b w:val="0"/>
                 <w:sz w:val="20"/>
               </w:rPr>
-              <w:t>乘地铁2号线返回酒店。</w:t>
+              <w:t>地铁回酒店。</w:t>
             </w:r>
           </w:p>
         </w:tc>
@@ -3010,12 +2835,12 @@
           <w:color w:val="2E6DA4"/>
           <w:sz w:val="28"/>
         </w:rPr>
-        <w:t>7月11日（周六）犀浦同台换乘</w:t>
+        <w:t>7月11日（周六）都江堰与熊猫谷</w:t>
       </w:r>
     </w:p>
     <w:p>
       <w:pPr>
-        <w:spacing w:after="160"/>
+        <w:spacing w:after="80"/>
       </w:pPr>
       <w:r>
         <w:rPr>
@@ -3024,7 +2849,7 @@
           <w:color w:val="666666"/>
           <w:sz w:val="20"/>
         </w:rPr>
-        <w:t>都江堰水利，熊猫谷，四合院雅致晚餐</w:t>
+        <w:t>同台换乘，水利奇观</w:t>
       </w:r>
     </w:p>
     <w:tbl>
@@ -3094,7 +2919,7 @@
                 <w:b/>
                 <w:sz w:val="20"/>
               </w:rPr>
-              <w:t>08:00 - 08:50</w:t>
+              <w:t>08:00 - 09:30</w:t>
             </w:r>
           </w:p>
         </w:tc>
@@ -3109,7 +2934,7 @@
                 <w:b w:val="0"/>
                 <w:sz w:val="20"/>
               </w:rPr>
-              <w:t>【地铁】：通惠门站乘地铁2号线直达终点站"犀浦站"。</w:t>
+              <w:t>地铁2号线→犀浦，同台换乘城铁→都江堰。</w:t>
             </w:r>
           </w:p>
         </w:tc>
@@ -3129,7 +2954,7 @@
                 <w:b/>
                 <w:sz w:val="20"/>
               </w:rPr>
-              <w:t>08:50 - 09:30</w:t>
+              <w:t>09:30 - 12:00</w:t>
             </w:r>
           </w:p>
         </w:tc>
@@ -3144,77 +2969,7 @@
                 <w:b w:val="0"/>
                 <w:sz w:val="20"/>
               </w:rPr>
-              <w:t>【同台换乘】：站台无缝换乘城际动车直达"都江堰站"。</w:t>
-            </w:r>
-          </w:p>
-        </w:tc>
-      </w:tr>
-      <w:tr>
-        <w:tc>
-          <w:tcPr>
-            <w:tcW w:type="dxa" w:w="4703"/>
-          </w:tcPr>
-          <w:p>
-            <w:pPr>
-              <w:jc w:val="center"/>
-            </w:pPr>
-            <w:r>
-              <w:rPr>
-                <w:rFonts w:ascii="微软雅黑" w:hAnsi="微软雅黑" w:eastAsia="微软雅黑"/>
-                <w:b/>
-                <w:sz w:val="20"/>
-              </w:rPr>
-              <w:t>09:30 - 09:50</w:t>
-            </w:r>
-          </w:p>
-        </w:tc>
-        <w:tc>
-          <w:tcPr>
-            <w:tcW w:type="dxa" w:w="4703"/>
-          </w:tcPr>
-          <w:p>
-            <w:r>
-              <w:rPr>
-                <w:rFonts w:ascii="微软雅黑" w:hAnsi="微软雅黑" w:eastAsia="微软雅黑"/>
-                <w:b w:val="0"/>
-                <w:sz w:val="20"/>
-              </w:rPr>
-              <w:t>【打车】：都江堰站打车（15分钟）直达都江堰熊猫谷。</w:t>
-            </w:r>
-          </w:p>
-        </w:tc>
-      </w:tr>
-      <w:tr>
-        <w:tc>
-          <w:tcPr>
-            <w:tcW w:type="dxa" w:w="4703"/>
-          </w:tcPr>
-          <w:p>
-            <w:pPr>
-              <w:jc w:val="center"/>
-            </w:pPr>
-            <w:r>
-              <w:rPr>
-                <w:rFonts w:ascii="微软雅黑" w:hAnsi="微软雅黑" w:eastAsia="微软雅黑"/>
-                <w:b/>
-                <w:sz w:val="20"/>
-              </w:rPr>
-              <w:t>09:50 - 12:00</w:t>
-            </w:r>
-          </w:p>
-        </w:tc>
-        <w:tc>
-          <w:tcPr>
-            <w:tcW w:type="dxa" w:w="4703"/>
-          </w:tcPr>
-          <w:p>
-            <w:r>
-              <w:rPr>
-                <w:rFonts w:ascii="微软雅黑" w:hAnsi="微软雅黑" w:eastAsia="微软雅黑"/>
-                <w:b w:val="0"/>
-                <w:sz w:val="20"/>
-              </w:rPr>
-              <w:t>都江堰熊猫谷：看红熊猫在身边的树枝上攀爬。（温馨提示：红熊猫放养区暑期周末排队较长，需做好排队准备）。</w:t>
+              <w:t>熊猫谷（红熊猫放养区可能排队）。</w:t>
             </w:r>
           </w:p>
         </w:tc>
@@ -3249,7 +3004,7 @@
                 <w:b w:val="0"/>
                 <w:sz w:val="20"/>
               </w:rPr>
-              <w:t>【地道午餐】：钟鸭子（都江堰总店）。推荐菜：招牌甜皮鸭、鸭架汤。</w:t>
+              <w:t>【午餐】钟鸭子（都江堰总店）。</w:t>
             </w:r>
           </w:p>
         </w:tc>
@@ -3284,7 +3039,7 @@
                 <w:b w:val="0"/>
                 <w:sz w:val="20"/>
               </w:rPr>
-              <w:t>都江堰水利景区：打车至景区东北门秦堰楼（6号门），从制高点顺着下坡方向游览，轻松省脚力，依次看鱼嘴、飞沙堰、宝瓶口。</w:t>
+              <w:t>秦堰楼6号门进，顺坡下行游览都江堰。</w:t>
             </w:r>
           </w:p>
         </w:tc>
@@ -3304,7 +3059,7 @@
                 <w:b/>
                 <w:sz w:val="20"/>
               </w:rPr>
-              <w:t>16:00 - 16:30</w:t>
+              <w:t>16:00 - 18:00</w:t>
             </w:r>
           </w:p>
         </w:tc>
@@ -3319,42 +3074,7 @@
                 <w:b w:val="0"/>
                 <w:sz w:val="20"/>
               </w:rPr>
-              <w:t>从景区南门出，在旁边的离堆公园站搭乘城际动车返回犀浦。</w:t>
-            </w:r>
-          </w:p>
-        </w:tc>
-      </w:tr>
-      <w:tr>
-        <w:tc>
-          <w:tcPr>
-            <w:tcW w:type="dxa" w:w="4703"/>
-          </w:tcPr>
-          <w:p>
-            <w:pPr>
-              <w:jc w:val="center"/>
-            </w:pPr>
-            <w:r>
-              <w:rPr>
-                <w:rFonts w:ascii="微软雅黑" w:hAnsi="微软雅黑" w:eastAsia="微软雅黑"/>
-                <w:b/>
-                <w:sz w:val="20"/>
-              </w:rPr>
-              <w:t>16:45 - 18:00</w:t>
-            </w:r>
-          </w:p>
-        </w:tc>
-        <w:tc>
-          <w:tcPr>
-            <w:tcW w:type="dxa" w:w="4703"/>
-          </w:tcPr>
-          <w:p>
-            <w:r>
-              <w:rPr>
-                <w:rFonts w:ascii="微软雅黑" w:hAnsi="微软雅黑" w:eastAsia="微软雅黑"/>
-                <w:b w:val="0"/>
-                <w:sz w:val="20"/>
-              </w:rPr>
-              <w:t>犀浦换乘地铁2号线返回酒店，洗澡换衣服，彻底放松。</w:t>
+              <w:t>离堆公园站→犀浦→地铁回酒店。</w:t>
             </w:r>
           </w:p>
         </w:tc>
@@ -3389,7 +3109,7 @@
                 <w:b w:val="0"/>
                 <w:sz w:val="20"/>
               </w:rPr>
-              <w:t>【告别晚餐】：听香·新派川菜（宽窄巷子店）。精致的川西四合院餐厅，推荐菜：青花椒九吐鱼、招牌熊猫豆腐。</w:t>
+              <w:t>【告别晚餐】听香·新派川菜（宽窄巷子店）。</w:t>
             </w:r>
           </w:p>
         </w:tc>
@@ -3424,7 +3144,7 @@
                 <w:b w:val="0"/>
                 <w:sz w:val="20"/>
               </w:rPr>
-              <w:t>散步回酒店，整理行李。</w:t>
+              <w:t>整理行李。</w:t>
             </w:r>
           </w:p>
         </w:tc>
@@ -3447,7 +3167,7 @@
     </w:p>
     <w:p>
       <w:pPr>
-        <w:spacing w:after="160"/>
+        <w:spacing w:after="80"/>
       </w:pPr>
       <w:r>
         <w:rPr>
@@ -3456,7 +3176,7 @@
           <w:color w:val="666666"/>
           <w:sz w:val="20"/>
         </w:rPr>
-        <w:t>地铁直达，温馨返程</w:t>
+        <w:t>双机场返程</w:t>
       </w:r>
     </w:p>
     <w:tbl>
@@ -3541,7 +3261,7 @@
                 <w:b w:val="0"/>
                 <w:sz w:val="20"/>
               </w:rPr>
-              <w:t>酒店早餐，办理退房。</w:t>
+              <w:t>早餐，退房。</w:t>
             </w:r>
           </w:p>
         </w:tc>
@@ -3576,11 +3296,7 @@
                 <w:b w:val="0"/>
                 <w:sz w:val="20"/>
               </w:rPr>
-              <w:t>【地铁直达机场】：</w:t>
-              <w:br/>
-              <w:t>若双流机场（CTU）：地铁2号线 → 3号线 → 10号线。</w:t>
-              <w:br/>
-              <w:t>若天府机场（TFU）：地铁2号线 → 1号线 → 18号线大站快车。</w:t>
+              <w:t>A.双流机场—打车约40-50元；B.天府机场—地铁18号线大站快车。</w:t>
             </w:r>
           </w:p>
         </w:tc>
@@ -3615,7 +3331,7 @@
                 <w:b w:val="0"/>
                 <w:sz w:val="20"/>
               </w:rPr>
-              <w:t>机场值机，享用简餐，乘机飞返惠州。</w:t>
+              <w:t>值机，飞返惠州。</w:t>
             </w:r>
           </w:p>
         </w:tc>
@@ -3638,12 +3354,12 @@
           <w:color w:val="1A477A"/>
           <w:sz w:val="36"/>
         </w:rPr>
-        <w:t>第二部分：要买和预约的门票/车票清单</w:t>
+        <w:t>第二部分：详细交通指南</w:t>
       </w:r>
     </w:p>
     <w:p>
       <w:pPr>
-        <w:spacing w:after="240"/>
+        <w:spacing w:after="80"/>
       </w:pPr>
       <w:r>
         <w:rPr>
@@ -3651,7 +3367,2615 @@
           <w:b w:val="0"/>
           <w:sz w:val="20"/>
         </w:rPr>
-        <w:t>暑假（7月）是西安和成都的超级旅游旺季，大部分门票必须提前定闹钟抢购。以下按购买/预约的时间顺序为您梳理：</w:t>
+        <w:t>以下为每日逐段交通路线，含地铁换乘、打车定位、步行方向及预估时间与费用。</w:t>
+      </w:r>
+    </w:p>
+    <w:p>
+      <w:pPr>
+        <w:spacing w:before="240" w:after="120"/>
+      </w:pPr>
+      <w:r>
+        <w:rPr>
+          <w:rFonts w:ascii="微软雅黑" w:hAnsi="微软雅黑" w:eastAsia="微软雅黑"/>
+          <w:b/>
+          <w:color w:val="2E6DA4"/>
+          <w:sz w:val="28"/>
+        </w:rPr>
+        <w:t>7月4日（周六）广州 → 西安 | 机场至大雁塔酒店</w:t>
+      </w:r>
+    </w:p>
+    <w:p>
+      <w:pPr>
+        <w:spacing w:before="240" w:after="120"/>
+      </w:pPr>
+      <w:r>
+        <w:rPr>
+          <w:rFonts w:ascii="微软雅黑" w:hAnsi="微软雅黑" w:eastAsia="微软雅黑"/>
+          <w:b/>
+          <w:color w:val="4472C4"/>
+          <w:sz w:val="24"/>
+        </w:rPr>
+        <w:t>1. 【咸阳机场】 → 【大雁塔雅缦东方庭院酒店】</w:t>
+      </w:r>
+    </w:p>
+    <w:p>
+      <w:pPr>
+        <w:spacing w:after="80"/>
+      </w:pPr>
+      <w:r>
+        <w:rPr>
+          <w:rFonts w:ascii="微软雅黑" w:hAnsi="微软雅黑" w:eastAsia="微软雅黑"/>
+          <w:b/>
+          <w:color w:val="2E6DA4"/>
+          <w:sz w:val="20"/>
+        </w:rPr>
+        <w:t>交通方式：地铁 14 号线 → 地铁 4 号线</w:t>
+      </w:r>
+    </w:p>
+    <w:p>
+      <w:pPr>
+        <w:spacing w:after="80"/>
+      </w:pPr>
+      <w:r>
+        <w:rPr>
+          <w:rFonts w:ascii="微软雅黑" w:hAnsi="微软雅黑" w:eastAsia="微软雅黑"/>
+          <w:b/>
+          <w:sz w:val="20"/>
+        </w:rPr>
+        <w:t>乘车步骤：</w:t>
+      </w:r>
+    </w:p>
+    <w:p>
+      <w:pPr>
+        <w:pStyle w:val="ListBullet"/>
+        <w:spacing w:after="40"/>
+      </w:pPr>
+      <w:r>
+        <w:rPr>
+          <w:rFonts w:ascii="微软雅黑" w:hAnsi="微软雅黑" w:eastAsia="微软雅黑"/>
+          <w:b w:val="0"/>
+          <w:sz w:val="20"/>
+        </w:rPr>
+        <w:t>下飞机取完行李后，顺着机场内“地铁/轨道交通”标识步行至【机场西站（T1/T2/T3）】地铁站口。</w:t>
+      </w:r>
+    </w:p>
+    <w:p>
+      <w:pPr>
+        <w:pStyle w:val="ListBullet"/>
+        <w:spacing w:after="40"/>
+      </w:pPr>
+      <w:r>
+        <w:rPr>
+          <w:rFonts w:ascii="微软雅黑" w:hAnsi="微软雅黑" w:eastAsia="微软雅黑"/>
+          <w:b w:val="0"/>
+          <w:sz w:val="20"/>
+        </w:rPr>
+        <w:t>刷卡/扫码进站，搭乘【地铁14号线】（往“贺韶”方向），坐7站（约32分钟），在【西安北站】下车。</w:t>
+      </w:r>
+    </w:p>
+    <w:p>
+      <w:pPr>
+        <w:pStyle w:val="ListBullet"/>
+        <w:spacing w:after="40"/>
+      </w:pPr>
+      <w:r>
+        <w:rPr>
+          <w:rFonts w:ascii="微软雅黑" w:hAnsi="微软雅黑" w:eastAsia="微软雅黑"/>
+          <w:b w:val="0"/>
+          <w:sz w:val="20"/>
+        </w:rPr>
+        <w:t>在【西安北站】站内顺着“换乘地铁4号线”标识，换乘【地铁4号线】（往“航天新城”方向）。</w:t>
+      </w:r>
+    </w:p>
+    <w:p>
+      <w:pPr>
+        <w:pStyle w:val="ListBullet"/>
+        <w:spacing w:after="40"/>
+      </w:pPr>
+      <w:r>
+        <w:rPr>
+          <w:rFonts w:ascii="微软雅黑" w:hAnsi="微软雅黑" w:eastAsia="微软雅黑"/>
+          <w:b w:val="0"/>
+          <w:sz w:val="20"/>
+        </w:rPr>
+        <w:t>坐16站（约41分钟），在【大雁塔站】下车。</w:t>
+      </w:r>
+    </w:p>
+    <w:p>
+      <w:pPr>
+        <w:pStyle w:val="ListBullet"/>
+        <w:spacing w:after="40"/>
+      </w:pPr>
+      <w:r>
+        <w:rPr>
+          <w:rFonts w:ascii="微软雅黑" w:hAnsi="微软雅黑" w:eastAsia="微软雅黑"/>
+          <w:b w:val="0"/>
+          <w:sz w:val="20"/>
+        </w:rPr>
+        <w:t>从【大雁塔站 C出口（西南口）】或【D出口（东南口）】出站。</w:t>
+      </w:r>
+    </w:p>
+    <w:p>
+      <w:pPr>
+        <w:pStyle w:val="ListBullet"/>
+        <w:spacing w:after="40"/>
+      </w:pPr>
+      <w:r>
+        <w:rPr>
+          <w:rFonts w:ascii="微软雅黑" w:hAnsi="微软雅黑" w:eastAsia="微软雅黑"/>
+          <w:b w:val="0"/>
+          <w:sz w:val="20"/>
+        </w:rPr>
+        <w:t>出站后向南步行约100米至大悦城十字路口，右转进入【慈恩西路】，顺路向南直行约600米，路西即达【雅缦东方庭院酒店】。</w:t>
+      </w:r>
+    </w:p>
+    <w:p>
+      <w:pPr>
+        <w:spacing w:after="80"/>
+      </w:pPr>
+      <w:r>
+        <w:rPr>
+          <w:rFonts w:ascii="微软雅黑" w:hAnsi="微软雅黑" w:eastAsia="微软雅黑"/>
+          <w:b/>
+          <w:color w:val="C0392B"/>
+          <w:sz w:val="20"/>
+        </w:rPr>
+        <w:t>预估时间：约2小时 | 票价：约9元/人</w:t>
+      </w:r>
+    </w:p>
+    <w:p/>
+    <w:p>
+      <w:pPr>
+        <w:spacing w:before="240" w:after="120"/>
+      </w:pPr>
+      <w:r>
+        <w:rPr>
+          <w:rFonts w:ascii="微软雅黑" w:hAnsi="微软雅黑" w:eastAsia="微软雅黑"/>
+          <w:b/>
+          <w:color w:val="2E6DA4"/>
+          <w:sz w:val="28"/>
+        </w:rPr>
+        <w:t>7月5日（周日）兵马俑、丽山园、世博园千古情</w:t>
+      </w:r>
+    </w:p>
+    <w:p>
+      <w:pPr>
+        <w:spacing w:before="240" w:after="120"/>
+      </w:pPr>
+      <w:r>
+        <w:rPr>
+          <w:rFonts w:ascii="微软雅黑" w:hAnsi="微软雅黑" w:eastAsia="微软雅黑"/>
+          <w:b/>
+          <w:color w:val="4472C4"/>
+          <w:sz w:val="24"/>
+        </w:rPr>
+        <w:t>1. 【大雁塔酒店】 → 【兵马俑博物馆】</w:t>
+      </w:r>
+    </w:p>
+    <w:p>
+      <w:pPr>
+        <w:spacing w:after="80"/>
+      </w:pPr>
+      <w:r>
+        <w:rPr>
+          <w:rFonts w:ascii="微软雅黑" w:hAnsi="微软雅黑" w:eastAsia="微软雅黑"/>
+          <w:b/>
+          <w:color w:val="2E6DA4"/>
+          <w:sz w:val="20"/>
+        </w:rPr>
+        <w:t>交通方式：地铁 3 号线 → 1 号线 → 9 号线 → 打车</w:t>
+      </w:r>
+    </w:p>
+    <w:p>
+      <w:pPr>
+        <w:spacing w:after="80"/>
+      </w:pPr>
+      <w:r>
+        <w:rPr>
+          <w:rFonts w:ascii="微软雅黑" w:hAnsi="微软雅黑" w:eastAsia="微软雅黑"/>
+          <w:b/>
+          <w:sz w:val="20"/>
+        </w:rPr>
+        <w:t>乘车步骤：</w:t>
+      </w:r>
+    </w:p>
+    <w:p>
+      <w:pPr>
+        <w:pStyle w:val="ListBullet"/>
+        <w:spacing w:after="40"/>
+      </w:pPr>
+      <w:r>
+        <w:rPr>
+          <w:rFonts w:ascii="微软雅黑" w:hAnsi="微软雅黑" w:eastAsia="微软雅黑"/>
+          <w:b w:val="0"/>
+          <w:sz w:val="20"/>
+        </w:rPr>
+        <w:t>从酒店步行700米返回【大雁塔站】，搭乘【地铁3号线】（往“保税区”方向），坐4站，在【通化门站】下车。</w:t>
+      </w:r>
+    </w:p>
+    <w:p>
+      <w:pPr>
+        <w:pStyle w:val="ListBullet"/>
+        <w:spacing w:after="40"/>
+      </w:pPr>
+      <w:r>
+        <w:rPr>
+          <w:rFonts w:ascii="微软雅黑" w:hAnsi="微软雅黑" w:eastAsia="微软雅黑"/>
+          <w:b w:val="0"/>
+          <w:sz w:val="20"/>
+        </w:rPr>
+        <w:t>站内换乘【地铁1号线】（往“纺织城”方向），坐3站，到达【纺织城站】。</w:t>
+      </w:r>
+    </w:p>
+    <w:p>
+      <w:pPr>
+        <w:pStyle w:val="ListBullet"/>
+        <w:spacing w:after="40"/>
+      </w:pPr>
+      <w:r>
+        <w:rPr>
+          <w:rFonts w:ascii="微软雅黑" w:hAnsi="微软雅黑" w:eastAsia="微软雅黑"/>
+          <w:b w:val="0"/>
+          <w:sz w:val="20"/>
+        </w:rPr>
+        <w:t>站内换乘【地铁9号线】（往“秦陵西”方向），坐11站，在【华清池站】下车。</w:t>
+      </w:r>
+    </w:p>
+    <w:p>
+      <w:pPr>
+        <w:pStyle w:val="ListBullet"/>
+        <w:spacing w:after="40"/>
+      </w:pPr>
+      <w:r>
+        <w:rPr>
+          <w:rFonts w:ascii="微软雅黑" w:hAnsi="微软雅黑" w:eastAsia="微软雅黑"/>
+          <w:b w:val="0"/>
+          <w:sz w:val="20"/>
+        </w:rPr>
+        <w:t>从华清池站【C出口】出站，正规出租车排队区打车至“兵马俑售票处”（约8公里，15-20分钟，20-25元）。</w:t>
+      </w:r>
+    </w:p>
+    <w:p>
+      <w:pPr>
+        <w:spacing w:after="80"/>
+      </w:pPr>
+      <w:r>
+        <w:rPr>
+          <w:rFonts w:ascii="微软雅黑" w:hAnsi="微软雅黑" w:eastAsia="微软雅黑"/>
+          <w:b/>
+          <w:color w:val="C0392B"/>
+          <w:sz w:val="20"/>
+        </w:rPr>
+        <w:t>预估时间：1小时40分钟</w:t>
+      </w:r>
+    </w:p>
+    <w:p/>
+    <w:p>
+      <w:pPr>
+        <w:spacing w:before="240" w:after="120"/>
+      </w:pPr>
+      <w:r>
+        <w:rPr>
+          <w:rFonts w:ascii="微软雅黑" w:hAnsi="微软雅黑" w:eastAsia="微软雅黑"/>
+          <w:b/>
+          <w:color w:val="4472C4"/>
+          <w:sz w:val="24"/>
+        </w:rPr>
+        <w:t>2. 【兵马俑博物馆】 → 【丽山园】</w:t>
+      </w:r>
+    </w:p>
+    <w:p>
+      <w:pPr>
+        <w:spacing w:after="80"/>
+      </w:pPr>
+      <w:r>
+        <w:rPr>
+          <w:rFonts w:ascii="微软雅黑" w:hAnsi="微软雅黑" w:eastAsia="微软雅黑"/>
+          <w:b/>
+          <w:color w:val="2E6DA4"/>
+          <w:sz w:val="20"/>
+        </w:rPr>
+        <w:t>交通方式：景区免费摆渡大巴</w:t>
+      </w:r>
+    </w:p>
+    <w:p>
+      <w:pPr>
+        <w:spacing w:after="80"/>
+      </w:pPr>
+      <w:r>
+        <w:rPr>
+          <w:rFonts w:ascii="微软雅黑" w:hAnsi="微软雅黑" w:eastAsia="微软雅黑"/>
+          <w:b/>
+          <w:sz w:val="20"/>
+        </w:rPr>
+        <w:t>乘车步骤：</w:t>
+      </w:r>
+    </w:p>
+    <w:p>
+      <w:pPr>
+        <w:pStyle w:val="ListBullet"/>
+        <w:spacing w:after="40"/>
+      </w:pPr>
+      <w:r>
+        <w:rPr>
+          <w:rFonts w:ascii="微软雅黑" w:hAnsi="微软雅黑" w:eastAsia="微软雅黑"/>
+          <w:b w:val="0"/>
+          <w:sz w:val="20"/>
+        </w:rPr>
+        <w:t>参观完一、二、三号坑后，顺着出口指示牌至【兵马俑-丽山园免费摆渡车乘车点】。</w:t>
+      </w:r>
+    </w:p>
+    <w:p>
+      <w:pPr>
+        <w:pStyle w:val="ListBullet"/>
+        <w:spacing w:after="40"/>
+      </w:pPr>
+      <w:r>
+        <w:rPr>
+          <w:rFonts w:ascii="微软雅黑" w:hAnsi="微软雅黑" w:eastAsia="微软雅黑"/>
+          <w:b w:val="0"/>
+          <w:sz w:val="20"/>
+        </w:rPr>
+        <w:t>出示兵马俑门票（两园一票制），免费登车，约15分钟（2.2公里）至【丽山园景区入口】。</w:t>
+      </w:r>
+    </w:p>
+    <w:p>
+      <w:pPr>
+        <w:pStyle w:val="ListBullet"/>
+        <w:spacing w:after="40"/>
+      </w:pPr>
+      <w:r>
+        <w:rPr>
+          <w:rFonts w:ascii="微软雅黑" w:hAnsi="微软雅黑" w:eastAsia="微软雅黑"/>
+          <w:b w:val="0"/>
+          <w:sz w:val="20"/>
+        </w:rPr>
+        <w:t>入园后右手边购买15元/人电瓶观光车票，依次游览【铜车马博物馆】【K9901百戏俑坑】【秦陵封土】，随上随下。</w:t>
+      </w:r>
+    </w:p>
+    <w:p/>
+    <w:p>
+      <w:pPr>
+        <w:spacing w:before="240" w:after="120"/>
+      </w:pPr>
+      <w:r>
+        <w:rPr>
+          <w:rFonts w:ascii="微软雅黑" w:hAnsi="微软雅黑" w:eastAsia="微软雅黑"/>
+          <w:b/>
+          <w:color w:val="4472C4"/>
+          <w:sz w:val="24"/>
+        </w:rPr>
+        <w:t>3. 【丽山园】 → 【西安饭庄（临潼店）】</w:t>
+      </w:r>
+    </w:p>
+    <w:p>
+      <w:pPr>
+        <w:spacing w:after="80"/>
+      </w:pPr>
+      <w:r>
+        <w:rPr>
+          <w:rFonts w:ascii="微软雅黑" w:hAnsi="微软雅黑" w:eastAsia="微软雅黑"/>
+          <w:b/>
+          <w:color w:val="2E6DA4"/>
+          <w:sz w:val="20"/>
+        </w:rPr>
+        <w:t>交通方式：打车</w:t>
+      </w:r>
+    </w:p>
+    <w:p>
+      <w:pPr>
+        <w:spacing w:after="80"/>
+      </w:pPr>
+      <w:r>
+        <w:rPr>
+          <w:rFonts w:ascii="微软雅黑" w:hAnsi="微软雅黑" w:eastAsia="微软雅黑"/>
+          <w:b/>
+          <w:sz w:val="20"/>
+        </w:rPr>
+        <w:t>乘车步骤：</w:t>
+      </w:r>
+    </w:p>
+    <w:p>
+      <w:pPr>
+        <w:pStyle w:val="ListBullet"/>
+        <w:spacing w:after="40"/>
+      </w:pPr>
+      <w:r>
+        <w:rPr>
+          <w:rFonts w:ascii="微软雅黑" w:hAnsi="微软雅黑" w:eastAsia="微软雅黑"/>
+          <w:b w:val="0"/>
+          <w:sz w:val="20"/>
+        </w:rPr>
+        <w:t>丽山园大门出来后打车，目的地【西安饭庄（临潼店）】（临潼区三里村路5号）。</w:t>
+      </w:r>
+    </w:p>
+    <w:p>
+      <w:pPr>
+        <w:spacing w:after="80"/>
+      </w:pPr>
+      <w:r>
+        <w:rPr>
+          <w:rFonts w:ascii="微软雅黑" w:hAnsi="微软雅黑" w:eastAsia="微软雅黑"/>
+          <w:b/>
+          <w:color w:val="C0392B"/>
+          <w:sz w:val="20"/>
+        </w:rPr>
+        <w:t>车程约7.5公里，15分钟，车费约18-22元</w:t>
+      </w:r>
+    </w:p>
+    <w:p/>
+    <w:p>
+      <w:pPr>
+        <w:spacing w:before="240" w:after="120"/>
+      </w:pPr>
+      <w:r>
+        <w:rPr>
+          <w:rFonts w:ascii="微软雅黑" w:hAnsi="微软雅黑" w:eastAsia="微软雅黑"/>
+          <w:b/>
+          <w:color w:val="4472C4"/>
+          <w:sz w:val="24"/>
+        </w:rPr>
+        <w:t>4. 【西安饭庄（临潼店）】 → 【香湖湾世博园/西安千古情】</w:t>
+      </w:r>
+    </w:p>
+    <w:p>
+      <w:pPr>
+        <w:spacing w:after="80"/>
+      </w:pPr>
+      <w:r>
+        <w:rPr>
+          <w:rFonts w:ascii="微软雅黑" w:hAnsi="微软雅黑" w:eastAsia="微软雅黑"/>
+          <w:b/>
+          <w:color w:val="2E6DA4"/>
+          <w:sz w:val="20"/>
+        </w:rPr>
+        <w:t>交通方式：最推荐直接打车（家庭出行最省力）</w:t>
+      </w:r>
+    </w:p>
+    <w:p>
+      <w:pPr>
+        <w:spacing w:after="80"/>
+      </w:pPr>
+      <w:r>
+        <w:rPr>
+          <w:rFonts w:ascii="微软雅黑" w:hAnsi="微软雅黑" w:eastAsia="微软雅黑"/>
+          <w:b/>
+          <w:sz w:val="20"/>
+        </w:rPr>
+        <w:t>乘车步骤：</w:t>
+      </w:r>
+    </w:p>
+    <w:p>
+      <w:pPr>
+        <w:pStyle w:val="ListBullet"/>
+        <w:spacing w:after="40"/>
+      </w:pPr>
+      <w:r>
+        <w:rPr>
+          <w:rFonts w:ascii="微软雅黑" w:hAnsi="微软雅黑" w:eastAsia="微软雅黑"/>
+          <w:b w:val="0"/>
+          <w:sz w:val="20"/>
+        </w:rPr>
+        <w:t>推荐：打车定位【西安千古情景区售票处】，约22公里，25分钟，50-60元，全家可休息。</w:t>
+      </w:r>
+    </w:p>
+    <w:p>
+      <w:pPr>
+        <w:pStyle w:val="ListBullet"/>
+        <w:spacing w:after="40"/>
+      </w:pPr>
+      <w:r>
+        <w:rPr>
+          <w:rFonts w:ascii="微软雅黑" w:hAnsi="微软雅黑" w:eastAsia="微软雅黑"/>
+          <w:b w:val="0"/>
+          <w:sz w:val="20"/>
+        </w:rPr>
+        <w:t>备用地铁：步行600米至【芷阳广场站】→9号线→纺织城→1号线→通化门→3号线→香湖湾站，出站还需打车或步行1.2公里。</w:t>
+      </w:r>
+    </w:p>
+    <w:p/>
+    <w:p>
+      <w:pPr>
+        <w:spacing w:before="240" w:after="120"/>
+      </w:pPr>
+      <w:r>
+        <w:rPr>
+          <w:rFonts w:ascii="微软雅黑" w:hAnsi="微软雅黑" w:eastAsia="微软雅黑"/>
+          <w:b/>
+          <w:color w:val="4472C4"/>
+          <w:sz w:val="24"/>
+        </w:rPr>
+        <w:t>5. 【西安千古情】 → 【醉长安（大雁塔店）】 → 【大雁塔酒店】</w:t>
+      </w:r>
+    </w:p>
+    <w:p>
+      <w:pPr>
+        <w:spacing w:after="80"/>
+      </w:pPr>
+      <w:r>
+        <w:rPr>
+          <w:rFonts w:ascii="微软雅黑" w:hAnsi="微软雅黑" w:eastAsia="微软雅黑"/>
+          <w:b/>
+          <w:color w:val="2E6DA4"/>
+          <w:sz w:val="20"/>
+        </w:rPr>
+        <w:t>交通方式：地铁 3 号线直达</w:t>
+      </w:r>
+    </w:p>
+    <w:p>
+      <w:pPr>
+        <w:spacing w:after="80"/>
+      </w:pPr>
+      <w:r>
+        <w:rPr>
+          <w:rFonts w:ascii="微软雅黑" w:hAnsi="微软雅黑" w:eastAsia="微软雅黑"/>
+          <w:b/>
+          <w:sz w:val="20"/>
+        </w:rPr>
+        <w:t>乘车步骤：</w:t>
+      </w:r>
+    </w:p>
+    <w:p>
+      <w:pPr>
+        <w:pStyle w:val="ListBullet"/>
+        <w:spacing w:after="40"/>
+      </w:pPr>
+      <w:r>
+        <w:rPr>
+          <w:rFonts w:ascii="微软雅黑" w:hAnsi="微软雅黑" w:eastAsia="微软雅黑"/>
+          <w:b w:val="0"/>
+          <w:sz w:val="20"/>
+        </w:rPr>
+        <w:t>散场后返回【香湖湾地铁站】，搭乘【地铁3号线】（往“鱼化寨”方向），坐11站至【大雁塔站】。</w:t>
+      </w:r>
+    </w:p>
+    <w:p>
+      <w:pPr>
+        <w:pStyle w:val="ListBullet"/>
+        <w:spacing w:after="40"/>
+      </w:pPr>
+      <w:r>
+        <w:rPr>
+          <w:rFonts w:ascii="微软雅黑" w:hAnsi="微软雅黑" w:eastAsia="微软雅黑"/>
+          <w:b w:val="0"/>
+          <w:sz w:val="20"/>
+        </w:rPr>
+        <w:t>C/D出口出站即到大悦城和醉长安，晚饭后沿慈恩西路步行700米回酒店。</w:t>
+      </w:r>
+    </w:p>
+    <w:p/>
+    <w:p>
+      <w:pPr>
+        <w:spacing w:before="240" w:after="120"/>
+      </w:pPr>
+      <w:r>
+        <w:rPr>
+          <w:rFonts w:ascii="微软雅黑" w:hAnsi="微软雅黑" w:eastAsia="微软雅黑"/>
+          <w:b/>
+          <w:color w:val="2E6DA4"/>
+          <w:sz w:val="28"/>
+        </w:rPr>
+        <w:t>7月6日（周一）华山一日征服</w:t>
+      </w:r>
+    </w:p>
+    <w:p>
+      <w:pPr>
+        <w:spacing w:before="240" w:after="120"/>
+      </w:pPr>
+      <w:r>
+        <w:rPr>
+          <w:rFonts w:ascii="微软雅黑" w:hAnsi="微软雅黑" w:eastAsia="微软雅黑"/>
+          <w:b/>
+          <w:color w:val="4472C4"/>
+          <w:sz w:val="24"/>
+        </w:rPr>
+        <w:t>1. 【大雁塔酒店】 → 【西安北站】</w:t>
+      </w:r>
+    </w:p>
+    <w:p>
+      <w:pPr>
+        <w:spacing w:after="80"/>
+      </w:pPr>
+      <w:r>
+        <w:rPr>
+          <w:rFonts w:ascii="微软雅黑" w:hAnsi="微软雅黑" w:eastAsia="微软雅黑"/>
+          <w:b/>
+          <w:color w:val="2E6DA4"/>
+          <w:sz w:val="20"/>
+        </w:rPr>
+        <w:t>交通方式：地铁 4 号线</w:t>
+      </w:r>
+    </w:p>
+    <w:p>
+      <w:pPr>
+        <w:spacing w:after="80"/>
+      </w:pPr>
+      <w:r>
+        <w:rPr>
+          <w:rFonts w:ascii="微软雅黑" w:hAnsi="微软雅黑" w:eastAsia="微软雅黑"/>
+          <w:b/>
+          <w:sz w:val="20"/>
+        </w:rPr>
+        <w:t>乘车步骤：</w:t>
+      </w:r>
+    </w:p>
+    <w:p>
+      <w:pPr>
+        <w:pStyle w:val="ListBullet"/>
+        <w:spacing w:after="40"/>
+      </w:pPr>
+      <w:r>
+        <w:rPr>
+          <w:rFonts w:ascii="微软雅黑" w:hAnsi="微软雅黑" w:eastAsia="微软雅黑"/>
+          <w:b w:val="0"/>
+          <w:sz w:val="20"/>
+        </w:rPr>
+        <w:t>步行至【大雁塔站】，搭乘【地铁4号线】（往“西安北站”方向），坐16站直达【西安北站】（约41分钟）。</w:t>
+      </w:r>
+    </w:p>
+    <w:p>
+      <w:pPr>
+        <w:pStyle w:val="ListBullet"/>
+        <w:spacing w:after="40"/>
+      </w:pPr>
+      <w:r>
+        <w:rPr>
+          <w:rFonts w:ascii="微软雅黑" w:hAnsi="微软雅黑" w:eastAsia="微软雅黑"/>
+          <w:b w:val="0"/>
+          <w:sz w:val="20"/>
+        </w:rPr>
+        <w:t>出地铁后按“高铁出发/候车厅”指示牌上楼，进入高铁进站口。</w:t>
+      </w:r>
+    </w:p>
+    <w:p/>
+    <w:p>
+      <w:pPr>
+        <w:spacing w:before="240" w:after="120"/>
+      </w:pPr>
+      <w:r>
+        <w:rPr>
+          <w:rFonts w:ascii="微软雅黑" w:hAnsi="微软雅黑" w:eastAsia="微软雅黑"/>
+          <w:b/>
+          <w:color w:val="4472C4"/>
+          <w:sz w:val="24"/>
+        </w:rPr>
+        <w:t>2. 【华山北站】 → 【华山游客中心】</w:t>
+      </w:r>
+    </w:p>
+    <w:p>
+      <w:pPr>
+        <w:spacing w:after="80"/>
+      </w:pPr>
+      <w:r>
+        <w:rPr>
+          <w:rFonts w:ascii="微软雅黑" w:hAnsi="微软雅黑" w:eastAsia="微软雅黑"/>
+          <w:b/>
+          <w:color w:val="2E6DA4"/>
+          <w:sz w:val="20"/>
+        </w:rPr>
+        <w:t>交通方式：打车（最快）或免费公交</w:t>
+      </w:r>
+    </w:p>
+    <w:p>
+      <w:pPr>
+        <w:spacing w:after="80"/>
+      </w:pPr>
+      <w:r>
+        <w:rPr>
+          <w:rFonts w:ascii="微软雅黑" w:hAnsi="微软雅黑" w:eastAsia="微软雅黑"/>
+          <w:b/>
+          <w:sz w:val="20"/>
+        </w:rPr>
+        <w:t>乘车步骤：</w:t>
+      </w:r>
+    </w:p>
+    <w:p>
+      <w:pPr>
+        <w:pStyle w:val="ListBullet"/>
+        <w:spacing w:after="40"/>
+      </w:pPr>
+      <w:r>
+        <w:rPr>
+          <w:rFonts w:ascii="微软雅黑" w:hAnsi="微软雅黑" w:eastAsia="微软雅黑"/>
+          <w:b w:val="0"/>
+          <w:sz w:val="20"/>
+        </w:rPr>
+        <w:t>打车：出租车排队区至【华山生态广场/华山游客中心】，约6公里，15分钟，15-20元。</w:t>
+      </w:r>
+    </w:p>
+    <w:p>
+      <w:pPr>
+        <w:pStyle w:val="ListBullet"/>
+        <w:spacing w:after="40"/>
+      </w:pPr>
+      <w:r>
+        <w:rPr>
+          <w:rFonts w:ascii="微软雅黑" w:hAnsi="微软雅黑" w:eastAsia="微软雅黑"/>
+          <w:b w:val="0"/>
+          <w:sz w:val="20"/>
+        </w:rPr>
+        <w:t>免费公交：站前广场乘坐【华山1路】或【华山2路】直达游客中心。</w:t>
+      </w:r>
+    </w:p>
+    <w:p/>
+    <w:p>
+      <w:pPr>
+        <w:spacing w:before="240" w:after="120"/>
+      </w:pPr>
+      <w:r>
+        <w:rPr>
+          <w:rFonts w:ascii="微软雅黑" w:hAnsi="微软雅黑" w:eastAsia="微软雅黑"/>
+          <w:b/>
+          <w:color w:val="4472C4"/>
+          <w:sz w:val="24"/>
+        </w:rPr>
+        <w:t>3. 【华山游客中心】 → 【华山之巅（西上西下）】 → 【返回】</w:t>
+      </w:r>
+    </w:p>
+    <w:p>
+      <w:pPr>
+        <w:spacing w:after="80"/>
+      </w:pPr>
+      <w:r>
+        <w:rPr>
+          <w:rFonts w:ascii="微软雅黑" w:hAnsi="微软雅黑" w:eastAsia="微软雅黑"/>
+          <w:b/>
+          <w:color w:val="2E6DA4"/>
+          <w:sz w:val="20"/>
+        </w:rPr>
+        <w:t>交通方式：进山大巴 + 西峰索道</w:t>
+      </w:r>
+    </w:p>
+    <w:p>
+      <w:pPr>
+        <w:spacing w:after="80"/>
+      </w:pPr>
+      <w:r>
+        <w:rPr>
+          <w:rFonts w:ascii="微软雅黑" w:hAnsi="微软雅黑" w:eastAsia="微软雅黑"/>
+          <w:b/>
+          <w:sz w:val="20"/>
+        </w:rPr>
+        <w:t>乘车步骤：</w:t>
+      </w:r>
+    </w:p>
+    <w:p>
+      <w:pPr>
+        <w:pStyle w:val="ListBullet"/>
+        <w:spacing w:after="40"/>
+      </w:pPr>
+      <w:r>
+        <w:rPr>
+          <w:rFonts w:ascii="微软雅黑" w:hAnsi="微软雅黑" w:eastAsia="微软雅黑"/>
+          <w:b w:val="0"/>
+          <w:sz w:val="20"/>
+        </w:rPr>
+        <w:t>检票入园后至“西峰索道乘车点”，乘【西峰进山大巴】约40分钟至索道下站。</w:t>
+      </w:r>
+    </w:p>
+    <w:p>
+      <w:pPr>
+        <w:pStyle w:val="ListBullet"/>
+        <w:spacing w:after="40"/>
+      </w:pPr>
+      <w:r>
+        <w:rPr>
+          <w:rFonts w:ascii="微软雅黑" w:hAnsi="微软雅黑" w:eastAsia="微软雅黑"/>
+          <w:b w:val="0"/>
+          <w:sz w:val="20"/>
+        </w:rPr>
+        <w:t>步行台阶，排队乘【西峰索道（太华索道）】约20分钟至西峰索道上站。</w:t>
+      </w:r>
+    </w:p>
+    <w:p>
+      <w:pPr>
+        <w:pStyle w:val="ListBullet"/>
+        <w:spacing w:after="40"/>
+      </w:pPr>
+      <w:r>
+        <w:rPr>
+          <w:rFonts w:ascii="微软雅黑" w:hAnsi="微软雅黑" w:eastAsia="微软雅黑"/>
+          <w:b w:val="0"/>
+          <w:sz w:val="20"/>
+        </w:rPr>
+        <w:t>游览西峰、南峰后原路返回，乘索道下山，再乘出山大巴返回游客中心。</w:t>
+      </w:r>
+    </w:p>
+    <w:p/>
+    <w:p>
+      <w:pPr>
+        <w:spacing w:before="240" w:after="120"/>
+      </w:pPr>
+      <w:r>
+        <w:rPr>
+          <w:rFonts w:ascii="微软雅黑" w:hAnsi="微软雅黑" w:eastAsia="微软雅黑"/>
+          <w:b/>
+          <w:color w:val="4472C4"/>
+          <w:sz w:val="24"/>
+        </w:rPr>
+        <w:t>4. 【华山游客中心】 → 【华山北站】 → 【西安北站】 → 【大雁塔酒店】</w:t>
+      </w:r>
+    </w:p>
+    <w:p>
+      <w:pPr>
+        <w:spacing w:after="80"/>
+      </w:pPr>
+      <w:r>
+        <w:rPr>
+          <w:rFonts w:ascii="微软雅黑" w:hAnsi="微软雅黑" w:eastAsia="微软雅黑"/>
+          <w:b/>
+          <w:color w:val="2E6DA4"/>
+          <w:sz w:val="20"/>
+        </w:rPr>
+        <w:t>交通方式：打车 → 高铁 → 地铁 4 号线</w:t>
+      </w:r>
+    </w:p>
+    <w:p>
+      <w:pPr>
+        <w:spacing w:after="80"/>
+      </w:pPr>
+      <w:r>
+        <w:rPr>
+          <w:rFonts w:ascii="微软雅黑" w:hAnsi="微软雅黑" w:eastAsia="微软雅黑"/>
+          <w:b/>
+          <w:sz w:val="20"/>
+        </w:rPr>
+        <w:t>乘车步骤：</w:t>
+      </w:r>
+    </w:p>
+    <w:p>
+      <w:pPr>
+        <w:pStyle w:val="ListBullet"/>
+        <w:spacing w:after="40"/>
+      </w:pPr>
+      <w:r>
+        <w:rPr>
+          <w:rFonts w:ascii="微软雅黑" w:hAnsi="微软雅黑" w:eastAsia="微软雅黑"/>
+          <w:b w:val="0"/>
+          <w:sz w:val="20"/>
+        </w:rPr>
+        <w:t>游客中心打车回【华山北站】，高铁返回【西安北站】。</w:t>
+      </w:r>
+    </w:p>
+    <w:p>
+      <w:pPr>
+        <w:pStyle w:val="ListBullet"/>
+        <w:spacing w:after="40"/>
+      </w:pPr>
+      <w:r>
+        <w:rPr>
+          <w:rFonts w:ascii="微软雅黑" w:hAnsi="微软雅黑" w:eastAsia="微软雅黑"/>
+          <w:b w:val="0"/>
+          <w:sz w:val="20"/>
+        </w:rPr>
+        <w:t>站内地铁通道搭乘【地铁4号线】直达【大雁塔站】，步行回酒店。</w:t>
+      </w:r>
+    </w:p>
+    <w:p/>
+    <w:p>
+      <w:pPr>
+        <w:spacing w:before="240" w:after="120"/>
+      </w:pPr>
+      <w:r>
+        <w:rPr>
+          <w:rFonts w:ascii="微软雅黑" w:hAnsi="微软雅黑" w:eastAsia="微软雅黑"/>
+          <w:b/>
+          <w:color w:val="2E6DA4"/>
+          <w:sz w:val="28"/>
+        </w:rPr>
+        <w:t>7月7日（周二）陕西历史博物馆、大皮院、城墙</w:t>
+      </w:r>
+    </w:p>
+    <w:p>
+      <w:pPr>
+        <w:spacing w:before="240" w:after="120"/>
+      </w:pPr>
+      <w:r>
+        <w:rPr>
+          <w:rFonts w:ascii="微软雅黑" w:hAnsi="微软雅黑" w:eastAsia="微软雅黑"/>
+          <w:b/>
+          <w:color w:val="4472C4"/>
+          <w:sz w:val="24"/>
+        </w:rPr>
+        <w:t>1. 【大雁塔酒店】 → 【陕西历史博物馆】</w:t>
+      </w:r>
+    </w:p>
+    <w:p>
+      <w:pPr>
+        <w:spacing w:after="80"/>
+      </w:pPr>
+      <w:r>
+        <w:rPr>
+          <w:rFonts w:ascii="微软雅黑" w:hAnsi="微软雅黑" w:eastAsia="微软雅黑"/>
+          <w:b/>
+          <w:color w:val="2E6DA4"/>
+          <w:sz w:val="20"/>
+        </w:rPr>
+        <w:t>交通方式：打车最省力（1.5公里）</w:t>
+      </w:r>
+    </w:p>
+    <w:p>
+      <w:pPr>
+        <w:spacing w:after="80"/>
+      </w:pPr>
+      <w:r>
+        <w:rPr>
+          <w:rFonts w:ascii="微软雅黑" w:hAnsi="微软雅黑" w:eastAsia="微软雅黑"/>
+          <w:b/>
+          <w:sz w:val="20"/>
+        </w:rPr>
+        <w:t>乘车步骤：</w:t>
+      </w:r>
+    </w:p>
+    <w:p>
+      <w:pPr>
+        <w:pStyle w:val="ListBullet"/>
+        <w:spacing w:after="40"/>
+      </w:pPr>
+      <w:r>
+        <w:rPr>
+          <w:rFonts w:ascii="微软雅黑" w:hAnsi="微软雅黑" w:eastAsia="微软雅黑"/>
+          <w:b w:val="0"/>
+          <w:sz w:val="20"/>
+        </w:rPr>
+        <w:t>打车至【陕西历史博物馆】（雁塔区小寨东路91号），约5分钟，10元左右。</w:t>
+      </w:r>
+    </w:p>
+    <w:p/>
+    <w:p>
+      <w:pPr>
+        <w:spacing w:before="240" w:after="120"/>
+      </w:pPr>
+      <w:r>
+        <w:rPr>
+          <w:rFonts w:ascii="微软雅黑" w:hAnsi="微软雅黑" w:eastAsia="微软雅黑"/>
+          <w:b/>
+          <w:color w:val="4472C4"/>
+          <w:sz w:val="24"/>
+        </w:rPr>
+        <w:t>2. 【陕西历史博物馆】 → 【志亮灌汤蒸饺（大皮院店）】</w:t>
+      </w:r>
+    </w:p>
+    <w:p>
+      <w:pPr>
+        <w:spacing w:after="80"/>
+      </w:pPr>
+      <w:r>
+        <w:rPr>
+          <w:rFonts w:ascii="微软雅黑" w:hAnsi="微软雅黑" w:eastAsia="微软雅黑"/>
+          <w:b/>
+          <w:color w:val="2E6DA4"/>
+          <w:sz w:val="20"/>
+        </w:rPr>
+        <w:t>交通方式：地铁 2 号线 → 地铁 6 号线</w:t>
+      </w:r>
+    </w:p>
+    <w:p>
+      <w:pPr>
+        <w:spacing w:after="80"/>
+      </w:pPr>
+      <w:r>
+        <w:rPr>
+          <w:rFonts w:ascii="微软雅黑" w:hAnsi="微软雅黑" w:eastAsia="微软雅黑"/>
+          <w:b/>
+          <w:sz w:val="20"/>
+        </w:rPr>
+        <w:t>乘车步骤：</w:t>
+      </w:r>
+    </w:p>
+    <w:p>
+      <w:pPr>
+        <w:pStyle w:val="ListBullet"/>
+        <w:spacing w:after="40"/>
+      </w:pPr>
+      <w:r>
+        <w:rPr>
+          <w:rFonts w:ascii="微软雅黑" w:hAnsi="微软雅黑" w:eastAsia="微软雅黑"/>
+          <w:b w:val="0"/>
+          <w:sz w:val="20"/>
+        </w:rPr>
+        <w:t>从陕历博向西步行约600米至【小寨地铁站】。</w:t>
+      </w:r>
+    </w:p>
+    <w:p>
+      <w:pPr>
+        <w:pStyle w:val="ListBullet"/>
+        <w:spacing w:after="40"/>
+      </w:pPr>
+      <w:r>
+        <w:rPr>
+          <w:rFonts w:ascii="微软雅黑" w:hAnsi="微软雅黑" w:eastAsia="微软雅黑"/>
+          <w:b w:val="0"/>
+          <w:sz w:val="20"/>
+        </w:rPr>
+        <w:t>搭乘【地铁2号线】（往“草滩”方向），坐3站至【钟楼站】。</w:t>
+      </w:r>
+    </w:p>
+    <w:p>
+      <w:pPr>
+        <w:pStyle w:val="ListBullet"/>
+        <w:spacing w:after="40"/>
+      </w:pPr>
+      <w:r>
+        <w:rPr>
+          <w:rFonts w:ascii="微软雅黑" w:hAnsi="微软雅黑" w:eastAsia="微软雅黑"/>
+          <w:b w:val="0"/>
+          <w:sz w:val="20"/>
+        </w:rPr>
+        <w:t>站内换乘【地铁6号线】（往“西安南站”方向），坐1站至【广济街站】。</w:t>
+      </w:r>
+    </w:p>
+    <w:p>
+      <w:pPr>
+        <w:pStyle w:val="ListBullet"/>
+        <w:spacing w:after="40"/>
+      </w:pPr>
+      <w:r>
+        <w:rPr>
+          <w:rFonts w:ascii="微软雅黑" w:hAnsi="微软雅黑" w:eastAsia="微软雅黑"/>
+          <w:b w:val="0"/>
+          <w:sz w:val="20"/>
+        </w:rPr>
+        <w:t>从【A出口（西北口）】出站，向北150米见【大皮院】牌坊右转，步行250米即到志亮灌汤蒸饺。</w:t>
+      </w:r>
+    </w:p>
+    <w:p/>
+    <w:p>
+      <w:pPr>
+        <w:spacing w:before="240" w:after="120"/>
+      </w:pPr>
+      <w:r>
+        <w:rPr>
+          <w:rFonts w:ascii="微软雅黑" w:hAnsi="微软雅黑" w:eastAsia="微软雅黑"/>
+          <w:b/>
+          <w:color w:val="4472C4"/>
+          <w:sz w:val="24"/>
+        </w:rPr>
+        <w:t>3. 【大皮院】 → 【大雁塔酒店（回房午休）】</w:t>
+      </w:r>
+    </w:p>
+    <w:p>
+      <w:pPr>
+        <w:spacing w:after="80"/>
+      </w:pPr>
+      <w:r>
+        <w:rPr>
+          <w:rFonts w:ascii="微软雅黑" w:hAnsi="微软雅黑" w:eastAsia="微软雅黑"/>
+          <w:b/>
+          <w:color w:val="2E6DA4"/>
+          <w:sz w:val="20"/>
+        </w:rPr>
+        <w:t>交通方式：地铁 6 号线 → 2 号线 → 3 号线</w:t>
+      </w:r>
+    </w:p>
+    <w:p>
+      <w:pPr>
+        <w:spacing w:after="80"/>
+      </w:pPr>
+      <w:r>
+        <w:rPr>
+          <w:rFonts w:ascii="微软雅黑" w:hAnsi="微软雅黑" w:eastAsia="微软雅黑"/>
+          <w:b/>
+          <w:sz w:val="20"/>
+        </w:rPr>
+        <w:t>乘车步骤：</w:t>
+      </w:r>
+    </w:p>
+    <w:p>
+      <w:pPr>
+        <w:pStyle w:val="ListBullet"/>
+        <w:spacing w:after="40"/>
+      </w:pPr>
+      <w:r>
+        <w:rPr>
+          <w:rFonts w:ascii="微软雅黑" w:hAnsi="微软雅黑" w:eastAsia="微软雅黑"/>
+          <w:b w:val="0"/>
+          <w:sz w:val="20"/>
+        </w:rPr>
+        <w:t>返回【广济街站】，6号线1站至【钟楼站】。</w:t>
+      </w:r>
+    </w:p>
+    <w:p>
+      <w:pPr>
+        <w:pStyle w:val="ListBullet"/>
+        <w:spacing w:after="40"/>
+      </w:pPr>
+      <w:r>
+        <w:rPr>
+          <w:rFonts w:ascii="微软雅黑" w:hAnsi="微软雅黑" w:eastAsia="微软雅黑"/>
+          <w:b w:val="0"/>
+          <w:sz w:val="20"/>
+        </w:rPr>
+        <w:t>换乘【地铁2号线】（往“常宁宫”方向），3站至【小寨站】。</w:t>
+      </w:r>
+    </w:p>
+    <w:p>
+      <w:pPr>
+        <w:pStyle w:val="ListBullet"/>
+        <w:spacing w:after="40"/>
+      </w:pPr>
+      <w:r>
+        <w:rPr>
+          <w:rFonts w:ascii="微软雅黑" w:hAnsi="微软雅黑" w:eastAsia="微软雅黑"/>
+          <w:b w:val="0"/>
+          <w:sz w:val="20"/>
+        </w:rPr>
+        <w:t>换乘【地铁3号线】（往“保税区”方向），1站至【大雁塔站】，步行回酒店。</w:t>
+      </w:r>
+    </w:p>
+    <w:p/>
+    <w:p>
+      <w:pPr>
+        <w:spacing w:before="240" w:after="120"/>
+      </w:pPr>
+      <w:r>
+        <w:rPr>
+          <w:rFonts w:ascii="微软雅黑" w:hAnsi="微软雅黑" w:eastAsia="微软雅黑"/>
+          <w:b/>
+          <w:color w:val="4472C4"/>
+          <w:sz w:val="24"/>
+        </w:rPr>
+        <w:t>4. 【大雁塔酒店】 → 【西安古城墙（永宁门南门）】</w:t>
+      </w:r>
+    </w:p>
+    <w:p>
+      <w:pPr>
+        <w:spacing w:after="80"/>
+      </w:pPr>
+      <w:r>
+        <w:rPr>
+          <w:rFonts w:ascii="微软雅黑" w:hAnsi="微软雅黑" w:eastAsia="微软雅黑"/>
+          <w:b/>
+          <w:color w:val="2E6DA4"/>
+          <w:sz w:val="20"/>
+        </w:rPr>
+        <w:t>交通方式：地铁 3 号线 → 2 号线</w:t>
+      </w:r>
+    </w:p>
+    <w:p>
+      <w:pPr>
+        <w:spacing w:after="80"/>
+      </w:pPr>
+      <w:r>
+        <w:rPr>
+          <w:rFonts w:ascii="微软雅黑" w:hAnsi="微软雅黑" w:eastAsia="微软雅黑"/>
+          <w:b/>
+          <w:sz w:val="20"/>
+        </w:rPr>
+        <w:t>乘车步骤：</w:t>
+      </w:r>
+    </w:p>
+    <w:p>
+      <w:pPr>
+        <w:pStyle w:val="ListBullet"/>
+        <w:spacing w:after="40"/>
+      </w:pPr>
+      <w:r>
+        <w:rPr>
+          <w:rFonts w:ascii="微软雅黑" w:hAnsi="微软雅黑" w:eastAsia="微软雅黑"/>
+          <w:b w:val="0"/>
+          <w:sz w:val="20"/>
+        </w:rPr>
+        <w:t>【大雁塔站】搭乘【地铁3号线】1站至【小寨站】。</w:t>
+      </w:r>
+    </w:p>
+    <w:p>
+      <w:pPr>
+        <w:pStyle w:val="ListBullet"/>
+        <w:spacing w:after="40"/>
+      </w:pPr>
+      <w:r>
+        <w:rPr>
+          <w:rFonts w:ascii="微软雅黑" w:hAnsi="微软雅黑" w:eastAsia="微软雅黑"/>
+          <w:b w:val="0"/>
+          <w:sz w:val="20"/>
+        </w:rPr>
+        <w:t>换乘【地铁2号线】（往“草滩”方向），3站至【永宁门站】。</w:t>
+      </w:r>
+    </w:p>
+    <w:p>
+      <w:pPr>
+        <w:pStyle w:val="ListBullet"/>
+        <w:spacing w:after="40"/>
+      </w:pPr>
+      <w:r>
+        <w:rPr>
+          <w:rFonts w:ascii="微软雅黑" w:hAnsi="微软雅黑" w:eastAsia="微软雅黑"/>
+          <w:b w:val="0"/>
+          <w:sz w:val="20"/>
+        </w:rPr>
+        <w:t>从【D1/D2出口】出站，直达南门瓮城广场和登城墙售票处。</w:t>
+      </w:r>
+    </w:p>
+    <w:p/>
+    <w:p>
+      <w:pPr>
+        <w:spacing w:before="240" w:after="120"/>
+      </w:pPr>
+      <w:r>
+        <w:rPr>
+          <w:rFonts w:ascii="微软雅黑" w:hAnsi="微软雅黑" w:eastAsia="微软雅黑"/>
+          <w:b/>
+          <w:color w:val="2E6DA4"/>
+          <w:sz w:val="28"/>
+        </w:rPr>
+        <w:t>7月8日（周三）西安 → 成都 | 宽窄巷子、老茶馆、锦江夜游</w:t>
+      </w:r>
+    </w:p>
+    <w:p>
+      <w:pPr>
+        <w:spacing w:before="240" w:after="120"/>
+      </w:pPr>
+      <w:r>
+        <w:rPr>
+          <w:rFonts w:ascii="微软雅黑" w:hAnsi="微软雅黑" w:eastAsia="微软雅黑"/>
+          <w:b/>
+          <w:color w:val="4472C4"/>
+          <w:sz w:val="24"/>
+        </w:rPr>
+        <w:t>1. 【成都东站】 → 【戴斯精选温德姆酒店（宽窄巷子店）】</w:t>
+      </w:r>
+    </w:p>
+    <w:p>
+      <w:pPr>
+        <w:spacing w:after="80"/>
+      </w:pPr>
+      <w:r>
+        <w:rPr>
+          <w:rFonts w:ascii="微软雅黑" w:hAnsi="微软雅黑" w:eastAsia="微软雅黑"/>
+          <w:b/>
+          <w:color w:val="2E6DA4"/>
+          <w:sz w:val="20"/>
+        </w:rPr>
+        <w:t>交通方式：成都地铁 2 号线直达</w:t>
+      </w:r>
+    </w:p>
+    <w:p>
+      <w:pPr>
+        <w:spacing w:after="80"/>
+      </w:pPr>
+      <w:r>
+        <w:rPr>
+          <w:rFonts w:ascii="微软雅黑" w:hAnsi="微软雅黑" w:eastAsia="微软雅黑"/>
+          <w:b/>
+          <w:sz w:val="20"/>
+        </w:rPr>
+        <w:t>乘车步骤：</w:t>
+      </w:r>
+    </w:p>
+    <w:p>
+      <w:pPr>
+        <w:pStyle w:val="ListBullet"/>
+        <w:spacing w:after="40"/>
+      </w:pPr>
+      <w:r>
+        <w:rPr>
+          <w:rFonts w:ascii="微软雅黑" w:hAnsi="微软雅黑" w:eastAsia="微软雅黑"/>
+          <w:b w:val="0"/>
+          <w:sz w:val="20"/>
+        </w:rPr>
+        <w:t>成都东站下高铁后跟随“地铁”标识进入地铁站厅。</w:t>
+      </w:r>
+    </w:p>
+    <w:p>
+      <w:pPr>
+        <w:pStyle w:val="ListBullet"/>
+        <w:spacing w:after="40"/>
+      </w:pPr>
+      <w:r>
+        <w:rPr>
+          <w:rFonts w:ascii="微软雅黑" w:hAnsi="微软雅黑" w:eastAsia="微软雅黑"/>
+          <w:b w:val="0"/>
+          <w:sz w:val="20"/>
+        </w:rPr>
+        <w:t>搭乘【地铁2号线】（往“犀浦”方向），9站至【通惠门站】。</w:t>
+      </w:r>
+    </w:p>
+    <w:p>
+      <w:pPr>
+        <w:pStyle w:val="ListBullet"/>
+        <w:spacing w:after="40"/>
+      </w:pPr>
+      <w:r>
+        <w:rPr>
+          <w:rFonts w:ascii="微软雅黑" w:hAnsi="微软雅黑" w:eastAsia="微软雅黑"/>
+          <w:b w:val="0"/>
+          <w:sz w:val="20"/>
+        </w:rPr>
+        <w:t>【C出口】出站，向西50米右转进入【琴台路】，前行100米即达酒店。</w:t>
+      </w:r>
+    </w:p>
+    <w:p/>
+    <w:p>
+      <w:pPr>
+        <w:spacing w:before="240" w:after="120"/>
+      </w:pPr>
+      <w:r>
+        <w:rPr>
+          <w:rFonts w:ascii="微软雅黑" w:hAnsi="微软雅黑" w:eastAsia="微软雅黑"/>
+          <w:b/>
+          <w:color w:val="4472C4"/>
+          <w:sz w:val="24"/>
+        </w:rPr>
+        <w:t>2. 【温德姆酒店】 → 【人民公园（鹤鸣茶社）】</w:t>
+      </w:r>
+    </w:p>
+    <w:p>
+      <w:pPr>
+        <w:spacing w:after="80"/>
+      </w:pPr>
+      <w:r>
+        <w:rPr>
+          <w:rFonts w:ascii="微软雅黑" w:hAnsi="微软雅黑" w:eastAsia="微软雅黑"/>
+          <w:b/>
+          <w:color w:val="2E6DA4"/>
+          <w:sz w:val="20"/>
+        </w:rPr>
+        <w:t>交通方式：步行</w:t>
+      </w:r>
+    </w:p>
+    <w:p>
+      <w:pPr>
+        <w:spacing w:after="80"/>
+      </w:pPr>
+      <w:r>
+        <w:rPr>
+          <w:rFonts w:ascii="微软雅黑" w:hAnsi="微软雅黑" w:eastAsia="微软雅黑"/>
+          <w:b/>
+          <w:sz w:val="20"/>
+        </w:rPr>
+        <w:t>乘车步骤：</w:t>
+      </w:r>
+    </w:p>
+    <w:p>
+      <w:pPr>
+        <w:pStyle w:val="ListBullet"/>
+        <w:spacing w:after="40"/>
+      </w:pPr>
+      <w:r>
+        <w:rPr>
+          <w:rFonts w:ascii="微软雅黑" w:hAnsi="微软雅黑" w:eastAsia="微软雅黑"/>
+          <w:b w:val="0"/>
+          <w:sz w:val="20"/>
+        </w:rPr>
+        <w:t>沿【琴台路】向南步行约300米至蜀都大道，过地下通道/天桥至【人民公园北门/西门】。</w:t>
+      </w:r>
+    </w:p>
+    <w:p>
+      <w:pPr>
+        <w:pStyle w:val="ListBullet"/>
+        <w:spacing w:after="40"/>
+      </w:pPr>
+      <w:r>
+        <w:rPr>
+          <w:rFonts w:ascii="微软雅黑" w:hAnsi="微软雅黑" w:eastAsia="微软雅黑"/>
+          <w:b w:val="0"/>
+          <w:sz w:val="20"/>
+        </w:rPr>
+        <w:t>进园后沿湖边步行约3分钟（有“鹤鸣茶社”指路牌）即达。</w:t>
+      </w:r>
+    </w:p>
+    <w:p/>
+    <w:p>
+      <w:pPr>
+        <w:spacing w:before="240" w:after="120"/>
+      </w:pPr>
+      <w:r>
+        <w:rPr>
+          <w:rFonts w:ascii="微软雅黑" w:hAnsi="微软雅黑" w:eastAsia="微软雅黑"/>
+          <w:b/>
+          <w:color w:val="4472C4"/>
+          <w:sz w:val="24"/>
+        </w:rPr>
+        <w:t>3. 【鹤鸣茶社】 → 【饕林餐厅（奎星楼店）】</w:t>
+      </w:r>
+    </w:p>
+    <w:p>
+      <w:pPr>
+        <w:spacing w:after="80"/>
+      </w:pPr>
+      <w:r>
+        <w:rPr>
+          <w:rFonts w:ascii="微软雅黑" w:hAnsi="微软雅黑" w:eastAsia="微软雅黑"/>
+          <w:b/>
+          <w:color w:val="2E6DA4"/>
+          <w:sz w:val="20"/>
+        </w:rPr>
+        <w:t>交通方式：步行或打车（约1.2公里）</w:t>
+      </w:r>
+    </w:p>
+    <w:p>
+      <w:pPr>
+        <w:spacing w:after="80"/>
+      </w:pPr>
+      <w:r>
+        <w:rPr>
+          <w:rFonts w:ascii="微软雅黑" w:hAnsi="微软雅黑" w:eastAsia="微软雅黑"/>
+          <w:b/>
+          <w:sz w:val="20"/>
+        </w:rPr>
+        <w:t>乘车步骤：</w:t>
+      </w:r>
+    </w:p>
+    <w:p>
+      <w:pPr>
+        <w:pStyle w:val="ListBullet"/>
+        <w:spacing w:after="40"/>
+      </w:pPr>
+      <w:r>
+        <w:rPr>
+          <w:rFonts w:ascii="微软雅黑" w:hAnsi="微软雅黑" w:eastAsia="微软雅黑"/>
+          <w:b w:val="0"/>
+          <w:sz w:val="20"/>
+        </w:rPr>
+        <w:t>步行：沿【长顺上街】向北约900米，左转进入【奎星楼街】即可。</w:t>
+      </w:r>
+    </w:p>
+    <w:p>
+      <w:pPr>
+        <w:pStyle w:val="ListBullet"/>
+        <w:spacing w:after="40"/>
+      </w:pPr>
+      <w:r>
+        <w:rPr>
+          <w:rFonts w:ascii="微软雅黑" w:hAnsi="微软雅黑" w:eastAsia="微软雅黑"/>
+          <w:b w:val="0"/>
+          <w:sz w:val="20"/>
+        </w:rPr>
+        <w:t>打车：滴滴定位，起步价约9元，5分钟。</w:t>
+      </w:r>
+    </w:p>
+    <w:p/>
+    <w:p>
+      <w:pPr>
+        <w:spacing w:before="240" w:after="120"/>
+      </w:pPr>
+      <w:r>
+        <w:rPr>
+          <w:rFonts w:ascii="微软雅黑" w:hAnsi="微软雅黑" w:eastAsia="微软雅黑"/>
+          <w:b/>
+          <w:color w:val="4472C4"/>
+          <w:sz w:val="24"/>
+        </w:rPr>
+        <w:t>4. 【饕林餐厅】 → 【东门码头（夜游锦江）】 → 【回酒店】</w:t>
+      </w:r>
+    </w:p>
+    <w:p>
+      <w:pPr>
+        <w:spacing w:after="80"/>
+      </w:pPr>
+      <w:r>
+        <w:rPr>
+          <w:rFonts w:ascii="微软雅黑" w:hAnsi="微软雅黑" w:eastAsia="微软雅黑"/>
+          <w:b/>
+          <w:color w:val="2E6DA4"/>
+          <w:sz w:val="20"/>
+        </w:rPr>
+        <w:t>交通方式：地铁 2 号线直达</w:t>
+      </w:r>
+    </w:p>
+    <w:p>
+      <w:pPr>
+        <w:spacing w:after="80"/>
+      </w:pPr>
+      <w:r>
+        <w:rPr>
+          <w:rFonts w:ascii="微软雅黑" w:hAnsi="微软雅黑" w:eastAsia="微软雅黑"/>
+          <w:b/>
+          <w:sz w:val="20"/>
+        </w:rPr>
+        <w:t>乘车步骤：</w:t>
+      </w:r>
+    </w:p>
+    <w:p>
+      <w:pPr>
+        <w:pStyle w:val="ListBullet"/>
+        <w:spacing w:after="40"/>
+      </w:pPr>
+      <w:r>
+        <w:rPr>
+          <w:rFonts w:ascii="微软雅黑" w:hAnsi="微软雅黑" w:eastAsia="微软雅黑"/>
+          <w:b w:val="0"/>
+          <w:sz w:val="20"/>
+        </w:rPr>
+        <w:t>步行400米至【通惠门站】，搭乘【地铁2号线】（往“龙泉驿”方向），4站至【东门大桥站】。</w:t>
+      </w:r>
+    </w:p>
+    <w:p>
+      <w:pPr>
+        <w:pStyle w:val="ListBullet"/>
+        <w:spacing w:after="40"/>
+      </w:pPr>
+      <w:r>
+        <w:rPr>
+          <w:rFonts w:ascii="微软雅黑" w:hAnsi="微软雅黑" w:eastAsia="微软雅黑"/>
+          <w:b w:val="0"/>
+          <w:sz w:val="20"/>
+        </w:rPr>
+        <w:t>【C出口】出站，沿东大街向西100米，左转【下东大街段/临江路】步行200米至【东门码头】。</w:t>
+      </w:r>
+    </w:p>
+    <w:p>
+      <w:pPr>
+        <w:pStyle w:val="ListBullet"/>
+        <w:spacing w:after="40"/>
+      </w:pPr>
+      <w:r>
+        <w:rPr>
+          <w:rFonts w:ascii="微软雅黑" w:hAnsi="微软雅黑" w:eastAsia="微软雅黑"/>
+          <w:b w:val="0"/>
+          <w:sz w:val="20"/>
+        </w:rPr>
+        <w:t>游船结束后原路返回【东门大桥站】，4站回【通惠门站】C口。</w:t>
+      </w:r>
+    </w:p>
+    <w:p/>
+    <w:p>
+      <w:pPr>
+        <w:spacing w:before="240" w:after="120"/>
+      </w:pPr>
+      <w:r>
+        <w:rPr>
+          <w:rFonts w:ascii="微软雅黑" w:hAnsi="微软雅黑" w:eastAsia="微软雅黑"/>
+          <w:b/>
+          <w:color w:val="2E6DA4"/>
+          <w:sz w:val="28"/>
+        </w:rPr>
+        <w:t>7月9日（周四）大熊猫基地、杜甫草堂、文殊坊大秀</w:t>
+      </w:r>
+    </w:p>
+    <w:p>
+      <w:pPr>
+        <w:spacing w:before="240" w:after="120"/>
+      </w:pPr>
+      <w:r>
+        <w:rPr>
+          <w:rFonts w:ascii="微软雅黑" w:hAnsi="微软雅黑" w:eastAsia="微软雅黑"/>
+          <w:b/>
+          <w:color w:val="4472C4"/>
+          <w:sz w:val="24"/>
+        </w:rPr>
+        <w:t>1. 【温德姆酒店】 → 【成都大熊猫繁育研究基地-南门】</w:t>
+      </w:r>
+    </w:p>
+    <w:p>
+      <w:pPr>
+        <w:spacing w:after="80"/>
+      </w:pPr>
+      <w:r>
+        <w:rPr>
+          <w:rFonts w:ascii="微软雅黑" w:hAnsi="微软雅黑" w:eastAsia="微软雅黑"/>
+          <w:b/>
+          <w:color w:val="2E6DA4"/>
+          <w:sz w:val="20"/>
+        </w:rPr>
+        <w:t>交通方式：最推荐直接打车</w:t>
+      </w:r>
+    </w:p>
+    <w:p>
+      <w:pPr>
+        <w:spacing w:after="80"/>
+      </w:pPr>
+      <w:r>
+        <w:rPr>
+          <w:rFonts w:ascii="微软雅黑" w:hAnsi="微软雅黑" w:eastAsia="微软雅黑"/>
+          <w:b/>
+          <w:sz w:val="20"/>
+        </w:rPr>
+        <w:t>乘车步骤：</w:t>
+      </w:r>
+    </w:p>
+    <w:p>
+      <w:pPr>
+        <w:pStyle w:val="ListBullet"/>
+        <w:spacing w:after="40"/>
+      </w:pPr>
+      <w:r>
+        <w:rPr>
+          <w:rFonts w:ascii="微软雅黑" w:hAnsi="微软雅黑" w:eastAsia="微软雅黑"/>
+          <w:b w:val="0"/>
+          <w:sz w:val="20"/>
+        </w:rPr>
+        <w:t>07:00在酒店门口打车，定位【成都大熊猫繁育研究基地-南门】。</w:t>
+      </w:r>
+    </w:p>
+    <w:p>
+      <w:pPr>
+        <w:pStyle w:val="ListBullet"/>
+        <w:spacing w:after="40"/>
+      </w:pPr>
+      <w:r>
+        <w:rPr>
+          <w:rFonts w:ascii="微软雅黑" w:hAnsi="微软雅黑" w:eastAsia="微软雅黑"/>
+          <w:b w:val="0"/>
+          <w:sz w:val="20"/>
+        </w:rPr>
+        <w:t>走一环路/北星高架，约18公里，35分钟，45-50元，确保清晨黄金时段入园。</w:t>
+      </w:r>
+    </w:p>
+    <w:p/>
+    <w:p>
+      <w:pPr>
+        <w:spacing w:before="240" w:after="120"/>
+      </w:pPr>
+      <w:r>
+        <w:rPr>
+          <w:rFonts w:ascii="微软雅黑" w:hAnsi="微软雅黑" w:eastAsia="微软雅黑"/>
+          <w:b/>
+          <w:color w:val="4472C4"/>
+          <w:sz w:val="24"/>
+        </w:rPr>
+        <w:t>2. 【大熊猫基地】 → 【盘飧市（春熙路店）】</w:t>
+      </w:r>
+    </w:p>
+    <w:p>
+      <w:pPr>
+        <w:spacing w:after="80"/>
+      </w:pPr>
+      <w:r>
+        <w:rPr>
+          <w:rFonts w:ascii="微软雅黑" w:hAnsi="微软雅黑" w:eastAsia="微软雅黑"/>
+          <w:b/>
+          <w:color w:val="2E6DA4"/>
+          <w:sz w:val="20"/>
+        </w:rPr>
+        <w:t>交通方式：景区直通大巴 或 打车</w:t>
+      </w:r>
+    </w:p>
+    <w:p>
+      <w:pPr>
+        <w:spacing w:after="80"/>
+      </w:pPr>
+      <w:r>
+        <w:rPr>
+          <w:rFonts w:ascii="微软雅黑" w:hAnsi="微软雅黑" w:eastAsia="微软雅黑"/>
+          <w:b/>
+          <w:sz w:val="20"/>
+        </w:rPr>
+        <w:t>乘车步骤：</w:t>
+      </w:r>
+    </w:p>
+    <w:p>
+      <w:pPr>
+        <w:pStyle w:val="ListBullet"/>
+        <w:spacing w:after="40"/>
+      </w:pPr>
+      <w:r>
+        <w:rPr>
+          <w:rFonts w:ascii="微软雅黑" w:hAnsi="微软雅黑" w:eastAsia="微软雅黑"/>
+          <w:b w:val="0"/>
+          <w:sz w:val="20"/>
+        </w:rPr>
+        <w:t>南门客运广场购买前往春熙路/IFS的景区直通车大巴。</w:t>
+      </w:r>
+    </w:p>
+    <w:p>
+      <w:pPr>
+        <w:pStyle w:val="ListBullet"/>
+        <w:spacing w:after="40"/>
+      </w:pPr>
+      <w:r>
+        <w:rPr>
+          <w:rFonts w:ascii="微软雅黑" w:hAnsi="微软雅黑" w:eastAsia="微软雅黑"/>
+          <w:b w:val="0"/>
+          <w:sz w:val="20"/>
+        </w:rPr>
+        <w:t>或打车至【盘飧市（春熙路店）】，约15公里，30分钟，35-40元。</w:t>
+      </w:r>
+    </w:p>
+    <w:p/>
+    <w:p>
+      <w:pPr>
+        <w:spacing w:before="240" w:after="120"/>
+      </w:pPr>
+      <w:r>
+        <w:rPr>
+          <w:rFonts w:ascii="微软雅黑" w:hAnsi="微软雅黑" w:eastAsia="微软雅黑"/>
+          <w:b/>
+          <w:color w:val="4472C4"/>
+          <w:sz w:val="24"/>
+        </w:rPr>
+        <w:t>3. 【盘飧市】 → 【温德姆酒店（回房午休）】</w:t>
+      </w:r>
+    </w:p>
+    <w:p>
+      <w:pPr>
+        <w:spacing w:after="80"/>
+      </w:pPr>
+      <w:r>
+        <w:rPr>
+          <w:rFonts w:ascii="微软雅黑" w:hAnsi="微软雅黑" w:eastAsia="微软雅黑"/>
+          <w:b/>
+          <w:color w:val="2E6DA4"/>
+          <w:sz w:val="20"/>
+        </w:rPr>
+        <w:t>交通方式：地铁 2 号线直达</w:t>
+      </w:r>
+    </w:p>
+    <w:p>
+      <w:pPr>
+        <w:spacing w:after="80"/>
+      </w:pPr>
+      <w:r>
+        <w:rPr>
+          <w:rFonts w:ascii="微软雅黑" w:hAnsi="微软雅黑" w:eastAsia="微软雅黑"/>
+          <w:b/>
+          <w:sz w:val="20"/>
+        </w:rPr>
+        <w:t>乘车步骤：</w:t>
+      </w:r>
+    </w:p>
+    <w:p>
+      <w:pPr>
+        <w:pStyle w:val="ListBullet"/>
+        <w:spacing w:after="40"/>
+      </w:pPr>
+      <w:r>
+        <w:rPr>
+          <w:rFonts w:ascii="微软雅黑" w:hAnsi="微软雅黑" w:eastAsia="微软雅黑"/>
+          <w:b w:val="0"/>
+          <w:sz w:val="20"/>
+        </w:rPr>
+        <w:t>步行300米至【春熙路站】，【地铁2号线】（往“犀浦”方向），3站至【通惠门站】。</w:t>
+      </w:r>
+    </w:p>
+    <w:p/>
+    <w:p>
+      <w:pPr>
+        <w:spacing w:before="240" w:after="120"/>
+      </w:pPr>
+      <w:r>
+        <w:rPr>
+          <w:rFonts w:ascii="微软雅黑" w:hAnsi="微软雅黑" w:eastAsia="微软雅黑"/>
+          <w:b/>
+          <w:color w:val="4472C4"/>
+          <w:sz w:val="24"/>
+        </w:rPr>
+        <w:t>4. 【温德姆酒店】 → 【杜甫草堂博物馆】</w:t>
+      </w:r>
+    </w:p>
+    <w:p>
+      <w:pPr>
+        <w:spacing w:after="80"/>
+      </w:pPr>
+      <w:r>
+        <w:rPr>
+          <w:rFonts w:ascii="微软雅黑" w:hAnsi="微软雅黑" w:eastAsia="微软雅黑"/>
+          <w:b/>
+          <w:color w:val="2E6DA4"/>
+          <w:sz w:val="20"/>
+        </w:rPr>
+        <w:t>交通方式：打车最省力（2.5公里）</w:t>
+      </w:r>
+    </w:p>
+    <w:p>
+      <w:pPr>
+        <w:spacing w:after="80"/>
+      </w:pPr>
+      <w:r>
+        <w:rPr>
+          <w:rFonts w:ascii="微软雅黑" w:hAnsi="微软雅黑" w:eastAsia="微软雅黑"/>
+          <w:b/>
+          <w:sz w:val="20"/>
+        </w:rPr>
+        <w:t>乘车步骤：</w:t>
+      </w:r>
+    </w:p>
+    <w:p>
+      <w:pPr>
+        <w:pStyle w:val="ListBullet"/>
+        <w:spacing w:after="40"/>
+      </w:pPr>
+      <w:r>
+        <w:rPr>
+          <w:rFonts w:ascii="微软雅黑" w:hAnsi="微软雅黑" w:eastAsia="微软雅黑"/>
+          <w:b w:val="0"/>
+          <w:sz w:val="20"/>
+        </w:rPr>
+        <w:t>打车至【杜甫草堂博物馆-北门】（青华路37号），约10分钟，10元左右。</w:t>
+      </w:r>
+    </w:p>
+    <w:p/>
+    <w:p>
+      <w:pPr>
+        <w:spacing w:before="240" w:after="120"/>
+      </w:pPr>
+      <w:r>
+        <w:rPr>
+          <w:rFonts w:ascii="微软雅黑" w:hAnsi="微软雅黑" w:eastAsia="微软雅黑"/>
+          <w:b/>
+          <w:color w:val="4472C4"/>
+          <w:sz w:val="24"/>
+        </w:rPr>
+        <w:t>5. 【杜甫草堂】 → 【洞子口张老二凉粉 / 文殊坊妙剧场】</w:t>
+      </w:r>
+    </w:p>
+    <w:p>
+      <w:pPr>
+        <w:spacing w:after="80"/>
+      </w:pPr>
+      <w:r>
+        <w:rPr>
+          <w:rFonts w:ascii="微软雅黑" w:hAnsi="微软雅黑" w:eastAsia="微软雅黑"/>
+          <w:b/>
+          <w:color w:val="2E6DA4"/>
+          <w:sz w:val="20"/>
+        </w:rPr>
+        <w:t>交通方式：地铁 4 号线 → 地铁 1 号线</w:t>
+      </w:r>
+    </w:p>
+    <w:p>
+      <w:pPr>
+        <w:spacing w:after="80"/>
+      </w:pPr>
+      <w:r>
+        <w:rPr>
+          <w:rFonts w:ascii="微软雅黑" w:hAnsi="微软雅黑" w:eastAsia="微软雅黑"/>
+          <w:b/>
+          <w:sz w:val="20"/>
+        </w:rPr>
+        <w:t>乘车步骤：</w:t>
+      </w:r>
+    </w:p>
+    <w:p>
+      <w:pPr>
+        <w:pStyle w:val="ListBullet"/>
+        <w:spacing w:after="40"/>
+      </w:pPr>
+      <w:r>
+        <w:rPr>
+          <w:rFonts w:ascii="微软雅黑" w:hAnsi="微软雅黑" w:eastAsia="微软雅黑"/>
+          <w:b w:val="0"/>
+          <w:sz w:val="20"/>
+        </w:rPr>
+        <w:t>从草堂北门向北步行约800米至【草堂北路站】。</w:t>
+      </w:r>
+    </w:p>
+    <w:p>
+      <w:pPr>
+        <w:pStyle w:val="ListBullet"/>
+        <w:spacing w:after="40"/>
+      </w:pPr>
+      <w:r>
+        <w:rPr>
+          <w:rFonts w:ascii="微软雅黑" w:hAnsi="微软雅黑" w:eastAsia="微软雅黑"/>
+          <w:b w:val="0"/>
+          <w:sz w:val="20"/>
+        </w:rPr>
+        <w:t>搭乘【地铁4号线】（往“西河”方向），4站至【骡马市站】。</w:t>
+      </w:r>
+    </w:p>
+    <w:p>
+      <w:pPr>
+        <w:pStyle w:val="ListBullet"/>
+        <w:spacing w:after="40"/>
+      </w:pPr>
+      <w:r>
+        <w:rPr>
+          <w:rFonts w:ascii="微软雅黑" w:hAnsi="微软雅黑" w:eastAsia="微软雅黑"/>
+          <w:b w:val="0"/>
+          <w:sz w:val="20"/>
+        </w:rPr>
+        <w:t>站内换乘【地铁1号线】（往“韦家碾”方向），1站至【文殊院站】。</w:t>
+      </w:r>
+    </w:p>
+    <w:p>
+      <w:pPr>
+        <w:pStyle w:val="ListBullet"/>
+        <w:spacing w:after="40"/>
+      </w:pPr>
+      <w:r>
+        <w:rPr>
+          <w:rFonts w:ascii="微软雅黑" w:hAnsi="微软雅黑" w:eastAsia="微软雅黑"/>
+          <w:b w:val="0"/>
+          <w:sz w:val="20"/>
+        </w:rPr>
+        <w:t>【K出口】出站，向东沿文殊院街步行300米，“洞子口张老二凉粉”在文殊院大门正对面。</w:t>
+      </w:r>
+    </w:p>
+    <w:p>
+      <w:pPr>
+        <w:pStyle w:val="ListBullet"/>
+        <w:spacing w:after="40"/>
+      </w:pPr>
+      <w:r>
+        <w:rPr>
+          <w:rFonts w:ascii="微软雅黑" w:hAnsi="微软雅黑" w:eastAsia="微软雅黑"/>
+          <w:b w:val="0"/>
+          <w:sz w:val="20"/>
+        </w:rPr>
+        <w:t>晚餐后在文殊坊找【妙剧场】看《花重锦官城》，结束后1号线→天府广场换乘2号线回酒店。</w:t>
+      </w:r>
+    </w:p>
+    <w:p/>
+    <w:p>
+      <w:pPr>
+        <w:spacing w:before="240" w:after="120"/>
+      </w:pPr>
+      <w:r>
+        <w:rPr>
+          <w:rFonts w:ascii="微软雅黑" w:hAnsi="微软雅黑" w:eastAsia="微软雅黑"/>
+          <w:b/>
+          <w:color w:val="2E6DA4"/>
+          <w:sz w:val="28"/>
+        </w:rPr>
+        <w:t>7月10日（周五）广汉三星堆奇妙日</w:t>
+      </w:r>
+    </w:p>
+    <w:p>
+      <w:pPr>
+        <w:spacing w:before="240" w:after="120"/>
+      </w:pPr>
+      <w:r>
+        <w:rPr>
+          <w:rFonts w:ascii="微软雅黑" w:hAnsi="微软雅黑" w:eastAsia="微软雅黑"/>
+          <w:b/>
+          <w:color w:val="4472C4"/>
+          <w:sz w:val="24"/>
+        </w:rPr>
+        <w:t>1. 【温德姆酒店】 → 【成都东站】 → 【广汉北站】</w:t>
+      </w:r>
+    </w:p>
+    <w:p>
+      <w:pPr>
+        <w:spacing w:after="80"/>
+      </w:pPr>
+      <w:r>
+        <w:rPr>
+          <w:rFonts w:ascii="微软雅黑" w:hAnsi="微软雅黑" w:eastAsia="微软雅黑"/>
+          <w:b/>
+          <w:color w:val="2E6DA4"/>
+          <w:sz w:val="20"/>
+        </w:rPr>
+        <w:t>交通方式：地铁 2 号线 + 高铁</w:t>
+      </w:r>
+    </w:p>
+    <w:p>
+      <w:pPr>
+        <w:spacing w:after="80"/>
+      </w:pPr>
+      <w:r>
+        <w:rPr>
+          <w:rFonts w:ascii="微软雅黑" w:hAnsi="微软雅黑" w:eastAsia="微软雅黑"/>
+          <w:b/>
+          <w:sz w:val="20"/>
+        </w:rPr>
+        <w:t>乘车步骤：</w:t>
+      </w:r>
+    </w:p>
+    <w:p>
+      <w:pPr>
+        <w:pStyle w:val="ListBullet"/>
+        <w:spacing w:after="40"/>
+      </w:pPr>
+      <w:r>
+        <w:rPr>
+          <w:rFonts w:ascii="微软雅黑" w:hAnsi="微软雅黑" w:eastAsia="微软雅黑"/>
+          <w:b w:val="0"/>
+          <w:sz w:val="20"/>
+        </w:rPr>
+        <w:t>【通惠门站】乘【地铁2号线】直达【成都东站】（9站，18分钟），上楼乘高铁至【广汉北站】。</w:t>
+      </w:r>
+    </w:p>
+    <w:p/>
+    <w:p>
+      <w:pPr>
+        <w:spacing w:before="240" w:after="120"/>
+      </w:pPr>
+      <w:r>
+        <w:rPr>
+          <w:rFonts w:ascii="微软雅黑" w:hAnsi="微软雅黑" w:eastAsia="微软雅黑"/>
+          <w:b/>
+          <w:color w:val="4472C4"/>
+          <w:sz w:val="24"/>
+        </w:rPr>
+        <w:t>2. 【广汉北站】 → 【三星堆博物馆-新馆】</w:t>
+      </w:r>
+    </w:p>
+    <w:p>
+      <w:pPr>
+        <w:spacing w:after="80"/>
+      </w:pPr>
+      <w:r>
+        <w:rPr>
+          <w:rFonts w:ascii="微软雅黑" w:hAnsi="微软雅黑" w:eastAsia="微软雅黑"/>
+          <w:b/>
+          <w:color w:val="2E6DA4"/>
+          <w:sz w:val="20"/>
+        </w:rPr>
+        <w:t>交通方式：打车最推荐</w:t>
+      </w:r>
+    </w:p>
+    <w:p>
+      <w:pPr>
+        <w:spacing w:after="80"/>
+      </w:pPr>
+      <w:r>
+        <w:rPr>
+          <w:rFonts w:ascii="微软雅黑" w:hAnsi="微软雅黑" w:eastAsia="微软雅黑"/>
+          <w:b/>
+          <w:sz w:val="20"/>
+        </w:rPr>
+        <w:t>乘车步骤：</w:t>
+      </w:r>
+    </w:p>
+    <w:p>
+      <w:pPr>
+        <w:pStyle w:val="ListBullet"/>
+        <w:spacing w:after="40"/>
+      </w:pPr>
+      <w:r>
+        <w:rPr>
+          <w:rFonts w:ascii="微软雅黑" w:hAnsi="微软雅黑" w:eastAsia="微软雅黑"/>
+          <w:b w:val="0"/>
+          <w:sz w:val="20"/>
+        </w:rPr>
+        <w:t>广汉北站站前打车至【三星堆博物馆新馆】，约7.5公里，15分钟，15-20元。</w:t>
+      </w:r>
+    </w:p>
+    <w:p>
+      <w:pPr>
+        <w:pStyle w:val="ListBullet"/>
+        <w:spacing w:after="40"/>
+      </w:pPr>
+      <w:r>
+        <w:rPr>
+          <w:rFonts w:ascii="微软雅黑" w:hAnsi="微软雅黑" w:eastAsia="微软雅黑"/>
+          <w:b w:val="0"/>
+          <w:sz w:val="20"/>
+        </w:rPr>
+        <w:t>下午游览完毕原路打车回广汉北站，高铁回成都。</w:t>
+      </w:r>
+    </w:p>
+    <w:p/>
+    <w:p>
+      <w:pPr>
+        <w:spacing w:before="240" w:after="120"/>
+      </w:pPr>
+      <w:r>
+        <w:rPr>
+          <w:rFonts w:ascii="微软雅黑" w:hAnsi="微软雅黑" w:eastAsia="微软雅黑"/>
+          <w:b/>
+          <w:color w:val="2E6DA4"/>
+          <w:sz w:val="28"/>
+        </w:rPr>
+        <w:t>7月11日（周六）都江堰与熊猫谷</w:t>
+      </w:r>
+    </w:p>
+    <w:p>
+      <w:pPr>
+        <w:spacing w:before="240" w:after="120"/>
+      </w:pPr>
+      <w:r>
+        <w:rPr>
+          <w:rFonts w:ascii="微软雅黑" w:hAnsi="微软雅黑" w:eastAsia="微软雅黑"/>
+          <w:b/>
+          <w:color w:val="4472C4"/>
+          <w:sz w:val="24"/>
+        </w:rPr>
+        <w:t>1. 【温德姆酒店】 → 【犀浦站】 → 【都江堰站】</w:t>
+      </w:r>
+    </w:p>
+    <w:p>
+      <w:pPr>
+        <w:spacing w:after="80"/>
+      </w:pPr>
+      <w:r>
+        <w:rPr>
+          <w:rFonts w:ascii="微软雅黑" w:hAnsi="微软雅黑" w:eastAsia="微软雅黑"/>
+          <w:b/>
+          <w:color w:val="2E6DA4"/>
+          <w:sz w:val="20"/>
+        </w:rPr>
+        <w:t>交通方式：地铁 2 号线 + 同台换乘城铁</w:t>
+      </w:r>
+    </w:p>
+    <w:p>
+      <w:pPr>
+        <w:spacing w:after="80"/>
+      </w:pPr>
+      <w:r>
+        <w:rPr>
+          <w:rFonts w:ascii="微软雅黑" w:hAnsi="微软雅黑" w:eastAsia="微软雅黑"/>
+          <w:b/>
+          <w:sz w:val="20"/>
+        </w:rPr>
+        <w:t>乘车步骤：</w:t>
+      </w:r>
+    </w:p>
+    <w:p>
+      <w:pPr>
+        <w:pStyle w:val="ListBullet"/>
+        <w:spacing w:after="40"/>
+      </w:pPr>
+      <w:r>
+        <w:rPr>
+          <w:rFonts w:ascii="微软雅黑" w:hAnsi="微软雅黑" w:eastAsia="微软雅黑"/>
+          <w:b w:val="0"/>
+          <w:sz w:val="20"/>
+        </w:rPr>
+        <w:t>【通惠门站】乘【地铁2号线】（往“犀浦”方向），14站（约28分钟）至【犀浦站】。</w:t>
+      </w:r>
+    </w:p>
+    <w:p>
+      <w:pPr>
+        <w:pStyle w:val="ListBullet"/>
+        <w:spacing w:after="40"/>
+      </w:pPr>
+      <w:r>
+        <w:rPr>
+          <w:rFonts w:ascii="微软雅黑" w:hAnsi="微软雅黑" w:eastAsia="微软雅黑"/>
+          <w:b w:val="0"/>
+          <w:sz w:val="20"/>
+        </w:rPr>
+        <w:t>【核心同台换乘】：不出站，走城铁通道刷身份证，直接登上前往【都江堰站】的城际列车。</w:t>
+      </w:r>
+    </w:p>
+    <w:p/>
+    <w:p>
+      <w:pPr>
+        <w:spacing w:before="240" w:after="120"/>
+      </w:pPr>
+      <w:r>
+        <w:rPr>
+          <w:rFonts w:ascii="微软雅黑" w:hAnsi="微软雅黑" w:eastAsia="微软雅黑"/>
+          <w:b/>
+          <w:color w:val="4472C4"/>
+          <w:sz w:val="24"/>
+        </w:rPr>
+        <w:t>2. 【都江堰站】 → 【都江堰熊猫谷】</w:t>
+      </w:r>
+    </w:p>
+    <w:p>
+      <w:pPr>
+        <w:spacing w:after="80"/>
+      </w:pPr>
+      <w:r>
+        <w:rPr>
+          <w:rFonts w:ascii="微软雅黑" w:hAnsi="微软雅黑" w:eastAsia="微软雅黑"/>
+          <w:b/>
+          <w:color w:val="2E6DA4"/>
+          <w:sz w:val="20"/>
+        </w:rPr>
+        <w:t>交通方式：打车</w:t>
+      </w:r>
+    </w:p>
+    <w:p>
+      <w:pPr>
+        <w:spacing w:after="80"/>
+      </w:pPr>
+      <w:r>
+        <w:rPr>
+          <w:rFonts w:ascii="微软雅黑" w:hAnsi="微软雅黑" w:eastAsia="微软雅黑"/>
+          <w:b/>
+          <w:sz w:val="20"/>
+        </w:rPr>
+        <w:t>乘车步骤：</w:t>
+      </w:r>
+    </w:p>
+    <w:p>
+      <w:pPr>
+        <w:pStyle w:val="ListBullet"/>
+        <w:spacing w:after="40"/>
+      </w:pPr>
+      <w:r>
+        <w:rPr>
+          <w:rFonts w:ascii="微软雅黑" w:hAnsi="微软雅黑" w:eastAsia="微软雅黑"/>
+          <w:b w:val="0"/>
+          <w:sz w:val="20"/>
+        </w:rPr>
+        <w:t>都江堰高铁站打车至【都江堰熊猫谷】，约9公里，15分钟，20元。</w:t>
+      </w:r>
+    </w:p>
+    <w:p/>
+    <w:p>
+      <w:pPr>
+        <w:spacing w:before="240" w:after="120"/>
+      </w:pPr>
+      <w:r>
+        <w:rPr>
+          <w:rFonts w:ascii="微软雅黑" w:hAnsi="微软雅黑" w:eastAsia="微软雅黑"/>
+          <w:b/>
+          <w:color w:val="4472C4"/>
+          <w:sz w:val="24"/>
+        </w:rPr>
+        <w:t>3. 【都江堰熊猫谷】 → 【钟鸭子（总店）】</w:t>
+      </w:r>
+    </w:p>
+    <w:p>
+      <w:pPr>
+        <w:spacing w:after="80"/>
+      </w:pPr>
+      <w:r>
+        <w:rPr>
+          <w:rFonts w:ascii="微软雅黑" w:hAnsi="微软雅黑" w:eastAsia="微软雅黑"/>
+          <w:b/>
+          <w:color w:val="2E6DA4"/>
+          <w:sz w:val="20"/>
+        </w:rPr>
+        <w:t>交通方式：打车</w:t>
+      </w:r>
+    </w:p>
+    <w:p>
+      <w:pPr>
+        <w:spacing w:after="80"/>
+      </w:pPr>
+      <w:r>
+        <w:rPr>
+          <w:rFonts w:ascii="微软雅黑" w:hAnsi="微软雅黑" w:eastAsia="微软雅黑"/>
+          <w:b/>
+          <w:sz w:val="20"/>
+        </w:rPr>
+        <w:t>乘车步骤：</w:t>
+      </w:r>
+    </w:p>
+    <w:p>
+      <w:pPr>
+        <w:pStyle w:val="ListBullet"/>
+        <w:spacing w:after="40"/>
+      </w:pPr>
+      <w:r>
+        <w:rPr>
+          <w:rFonts w:ascii="微软雅黑" w:hAnsi="微软雅黑" w:eastAsia="微软雅黑"/>
+          <w:b w:val="0"/>
+          <w:sz w:val="20"/>
+        </w:rPr>
+        <w:t>打车至【钟鸭子（都江堰总店）】（灌口建设路139号），约6.5公里，12分钟，15元。</w:t>
+      </w:r>
+    </w:p>
+    <w:p/>
+    <w:p>
+      <w:pPr>
+        <w:spacing w:before="240" w:after="120"/>
+      </w:pPr>
+      <w:r>
+        <w:rPr>
+          <w:rFonts w:ascii="微软雅黑" w:hAnsi="微软雅黑" w:eastAsia="微软雅黑"/>
+          <w:b/>
+          <w:color w:val="4472C4"/>
+          <w:sz w:val="24"/>
+        </w:rPr>
+        <w:t>4. 【钟鸭子】 → 【都江堰景区-秦堰楼6号门】</w:t>
+      </w:r>
+    </w:p>
+    <w:p>
+      <w:pPr>
+        <w:spacing w:after="80"/>
+      </w:pPr>
+      <w:r>
+        <w:rPr>
+          <w:rFonts w:ascii="微软雅黑" w:hAnsi="微软雅黑" w:eastAsia="微软雅黑"/>
+          <w:b/>
+          <w:color w:val="2E6DA4"/>
+          <w:sz w:val="20"/>
+        </w:rPr>
+        <w:t>交通方式：打车（务必定位6号门）</w:t>
+      </w:r>
+    </w:p>
+    <w:p>
+      <w:pPr>
+        <w:spacing w:after="80"/>
+      </w:pPr>
+      <w:r>
+        <w:rPr>
+          <w:rFonts w:ascii="微软雅黑" w:hAnsi="微软雅黑" w:eastAsia="微软雅黑"/>
+          <w:b/>
+          <w:sz w:val="20"/>
+        </w:rPr>
+        <w:t>乘车步骤：</w:t>
+      </w:r>
+    </w:p>
+    <w:p>
+      <w:pPr>
+        <w:pStyle w:val="ListBullet"/>
+        <w:spacing w:after="40"/>
+      </w:pPr>
+      <w:r>
+        <w:rPr>
+          <w:rFonts w:ascii="微软雅黑" w:hAnsi="微软雅黑" w:eastAsia="微软雅黑"/>
+          <w:b w:val="0"/>
+          <w:sz w:val="20"/>
+        </w:rPr>
+        <w:t>打车定位【都江堰景区-秦堰楼6号门】（不要去南门，南门需爬坡）。</w:t>
+      </w:r>
+    </w:p>
+    <w:p>
+      <w:pPr>
+        <w:pStyle w:val="ListBullet"/>
+        <w:spacing w:after="40"/>
+      </w:pPr>
+      <w:r>
+        <w:rPr>
+          <w:rFonts w:ascii="微软雅黑" w:hAnsi="微软雅黑" w:eastAsia="微软雅黑"/>
+          <w:b w:val="0"/>
+          <w:sz w:val="20"/>
+        </w:rPr>
+        <w:t>入园后顺坡下行：秦堰楼→安澜索桥→鱼嘴→飞沙堰→宝瓶口→离堆公园南门出。</w:t>
+      </w:r>
+    </w:p>
+    <w:p/>
+    <w:p>
+      <w:pPr>
+        <w:spacing w:before="240" w:after="120"/>
+      </w:pPr>
+      <w:r>
+        <w:rPr>
+          <w:rFonts w:ascii="微软雅黑" w:hAnsi="微软雅黑" w:eastAsia="微软雅黑"/>
+          <w:b/>
+          <w:color w:val="4472C4"/>
+          <w:sz w:val="24"/>
+        </w:rPr>
+        <w:t>5. 【都江堰景区南门】 → 【离堆公园站】 → 【犀浦站】</w:t>
+      </w:r>
+    </w:p>
+    <w:p>
+      <w:pPr>
+        <w:spacing w:after="80"/>
+      </w:pPr>
+      <w:r>
+        <w:rPr>
+          <w:rFonts w:ascii="微软雅黑" w:hAnsi="微软雅黑" w:eastAsia="微软雅黑"/>
+          <w:b/>
+          <w:color w:val="2E6DA4"/>
+          <w:sz w:val="20"/>
+        </w:rPr>
+        <w:t>交通方式：步行 + 城铁 + 地铁</w:t>
+      </w:r>
+    </w:p>
+    <w:p>
+      <w:pPr>
+        <w:spacing w:after="80"/>
+      </w:pPr>
+      <w:r>
+        <w:rPr>
+          <w:rFonts w:ascii="微软雅黑" w:hAnsi="微软雅黑" w:eastAsia="微软雅黑"/>
+          <w:b/>
+          <w:sz w:val="20"/>
+        </w:rPr>
+        <w:t>乘车步骤：</w:t>
+      </w:r>
+    </w:p>
+    <w:p>
+      <w:pPr>
+        <w:pStyle w:val="ListBullet"/>
+        <w:spacing w:after="40"/>
+      </w:pPr>
+      <w:r>
+        <w:rPr>
+          <w:rFonts w:ascii="微软雅黑" w:hAnsi="微软雅黑" w:eastAsia="微软雅黑"/>
+          <w:b w:val="0"/>
+          <w:sz w:val="20"/>
+        </w:rPr>
+        <w:t>南门出园后步行约600米（经灌县古城/南桥）至【离堆公园火车站】。</w:t>
+      </w:r>
+    </w:p>
+    <w:p>
+      <w:pPr>
+        <w:pStyle w:val="ListBullet"/>
+        <w:spacing w:after="40"/>
+      </w:pPr>
+      <w:r>
+        <w:rPr>
+          <w:rFonts w:ascii="微软雅黑" w:hAnsi="微软雅黑" w:eastAsia="微软雅黑"/>
+          <w:b w:val="0"/>
+          <w:sz w:val="20"/>
+        </w:rPr>
+        <w:t>城铁返回【犀浦站】，换乘【地铁2号线】至【通惠门站】，步行回酒店。</w:t>
+      </w:r>
+    </w:p>
+    <w:p/>
+    <w:p>
+      <w:pPr>
+        <w:spacing w:before="240" w:after="120"/>
+      </w:pPr>
+      <w:r>
+        <w:rPr>
+          <w:rFonts w:ascii="微软雅黑" w:hAnsi="微软雅黑" w:eastAsia="微软雅黑"/>
+          <w:b/>
+          <w:color w:val="2E6DA4"/>
+          <w:sz w:val="28"/>
+        </w:rPr>
+        <w:t>7月12日（周日）成都 → 惠州 | 双机场详细路线</w:t>
+      </w:r>
+    </w:p>
+    <w:p>
+      <w:pPr>
+        <w:spacing w:before="240" w:after="120"/>
+      </w:pPr>
+      <w:r>
+        <w:rPr>
+          <w:rFonts w:ascii="微软雅黑" w:hAnsi="微软雅黑" w:eastAsia="微软雅黑"/>
+          <w:b/>
+          <w:color w:val="4472C4"/>
+          <w:sz w:val="24"/>
+        </w:rPr>
+        <w:t>A. 若从【双流机场（CTU）】出发</w:t>
+      </w:r>
+    </w:p>
+    <w:p>
+      <w:pPr>
+        <w:spacing w:after="80"/>
+      </w:pPr>
+      <w:r>
+        <w:rPr>
+          <w:rFonts w:ascii="微软雅黑" w:hAnsi="微软雅黑" w:eastAsia="微软雅黑"/>
+          <w:b/>
+          <w:color w:val="2E6DA4"/>
+          <w:sz w:val="20"/>
+        </w:rPr>
+        <w:t>交通方式：最推荐直接打车</w:t>
+      </w:r>
+    </w:p>
+    <w:p>
+      <w:pPr>
+        <w:spacing w:after="80"/>
+      </w:pPr>
+      <w:r>
+        <w:rPr>
+          <w:rFonts w:ascii="微软雅黑" w:hAnsi="微软雅黑" w:eastAsia="微软雅黑"/>
+          <w:b/>
+          <w:sz w:val="20"/>
+        </w:rPr>
+        <w:t>乘车步骤：</w:t>
+      </w:r>
+    </w:p>
+    <w:p>
+      <w:pPr>
+        <w:pStyle w:val="ListBullet"/>
+        <w:spacing w:after="40"/>
+      </w:pPr>
+      <w:r>
+        <w:rPr>
+          <w:rFonts w:ascii="微软雅黑" w:hAnsi="微软雅黑" w:eastAsia="微软雅黑"/>
+          <w:b w:val="0"/>
+          <w:sz w:val="20"/>
+        </w:rPr>
+        <w:t>酒店门口打车至【成都双流国际机场T1/T2航站楼】。</w:t>
+      </w:r>
+    </w:p>
+    <w:p>
+      <w:pPr>
+        <w:spacing w:after="80"/>
+      </w:pPr>
+      <w:r>
+        <w:rPr>
+          <w:rFonts w:ascii="微软雅黑" w:hAnsi="微软雅黑" w:eastAsia="微软雅黑"/>
+          <w:b/>
+          <w:color w:val="C0392B"/>
+          <w:sz w:val="20"/>
+        </w:rPr>
+        <w:t>约18公里，25-30分钟，40-50元。带行李和孩子最方便。</w:t>
+      </w:r>
+    </w:p>
+    <w:p/>
+    <w:p>
+      <w:pPr>
+        <w:spacing w:before="240" w:after="120"/>
+      </w:pPr>
+      <w:r>
+        <w:rPr>
+          <w:rFonts w:ascii="微软雅黑" w:hAnsi="微软雅黑" w:eastAsia="微软雅黑"/>
+          <w:b/>
+          <w:color w:val="4472C4"/>
+          <w:sz w:val="24"/>
+        </w:rPr>
+        <w:t>B. 若从【天府机场（TFU）】出发</w:t>
+      </w:r>
+    </w:p>
+    <w:p>
+      <w:pPr>
+        <w:spacing w:after="80"/>
+      </w:pPr>
+      <w:r>
+        <w:rPr>
+          <w:rFonts w:ascii="微软雅黑" w:hAnsi="微软雅黑" w:eastAsia="微软雅黑"/>
+          <w:b/>
+          <w:color w:val="2E6DA4"/>
+          <w:sz w:val="20"/>
+        </w:rPr>
+        <w:t>交通方式：地铁大站快车（65公里，打车贵且易堵）</w:t>
+      </w:r>
+    </w:p>
+    <w:p>
+      <w:pPr>
+        <w:spacing w:after="80"/>
+      </w:pPr>
+      <w:r>
+        <w:rPr>
+          <w:rFonts w:ascii="微软雅黑" w:hAnsi="微软雅黑" w:eastAsia="微软雅黑"/>
+          <w:b/>
+          <w:sz w:val="20"/>
+        </w:rPr>
+        <w:t>乘车步骤：</w:t>
+      </w:r>
+    </w:p>
+    <w:p>
+      <w:pPr>
+        <w:pStyle w:val="ListBullet"/>
+        <w:spacing w:after="40"/>
+      </w:pPr>
+      <w:r>
+        <w:rPr>
+          <w:rFonts w:ascii="微软雅黑" w:hAnsi="微软雅黑" w:eastAsia="微软雅黑"/>
+          <w:b w:val="0"/>
+          <w:sz w:val="20"/>
+        </w:rPr>
+        <w:t>【通惠门站】乘【地铁2号线】2站至【天府广场站】。</w:t>
+      </w:r>
+    </w:p>
+    <w:p>
+      <w:pPr>
+        <w:pStyle w:val="ListBullet"/>
+        <w:spacing w:after="40"/>
+      </w:pPr>
+      <w:r>
+        <w:rPr>
+          <w:rFonts w:ascii="微软雅黑" w:hAnsi="微软雅黑" w:eastAsia="微软雅黑"/>
+          <w:b w:val="0"/>
+          <w:sz w:val="20"/>
+        </w:rPr>
+        <w:t>换乘【地铁1号线】（往“科学城”方向），7站至【火车南站】。</w:t>
+      </w:r>
+    </w:p>
+    <w:p>
+      <w:pPr>
+        <w:pStyle w:val="ListBullet"/>
+        <w:spacing w:after="40"/>
+      </w:pPr>
+      <w:r>
+        <w:rPr>
+          <w:rFonts w:ascii="微软雅黑" w:hAnsi="微软雅黑" w:eastAsia="微软雅黑"/>
+          <w:b w:val="0"/>
+          <w:sz w:val="20"/>
+        </w:rPr>
+        <w:t>换乘【地铁18号线】（往“天府机场北”方向），务必坐【大站快车Express】，37-40分钟直达【天府机场1号2号航站楼站】。</w:t>
+      </w:r>
+    </w:p>
+    <w:p>
+      <w:pPr>
+        <w:spacing w:after="80"/>
+      </w:pPr>
+      <w:r>
+        <w:rPr>
+          <w:rFonts w:ascii="微软雅黑" w:hAnsi="微软雅黑" w:eastAsia="微软雅黑"/>
+          <w:b/>
+          <w:color w:val="C0392B"/>
+          <w:sz w:val="20"/>
+        </w:rPr>
+        <w:t>全程地铁票价约10元/人</w:t>
+      </w:r>
+    </w:p>
+    <w:p/>
+    <w:p>
+      <w:r>
+        <w:br w:type="page"/>
+      </w:r>
+    </w:p>
+    <w:p>
+      <w:pPr>
+        <w:spacing w:before="120" w:after="120"/>
+      </w:pPr>
+      <w:r>
+        <w:rPr>
+          <w:rFonts w:ascii="微软雅黑" w:hAnsi="微软雅黑" w:eastAsia="微软雅黑"/>
+          <w:b/>
+          <w:color w:val="1A477A"/>
+          <w:sz w:val="36"/>
+        </w:rPr>
+        <w:t>第三部分：要买和预约的门票/车票清单</w:t>
+      </w:r>
+    </w:p>
+    <w:p>
+      <w:pPr>
+        <w:spacing w:after="80"/>
+      </w:pPr>
+      <w:r>
+        <w:rPr>
+          <w:rFonts w:ascii="微软雅黑" w:hAnsi="微软雅黑" w:eastAsia="微软雅黑"/>
+          <w:b w:val="0"/>
+          <w:sz w:val="20"/>
+        </w:rPr>
+        <w:t>暑假（7月）旺季，大部分门票须提前定闹钟抢购。</w:t>
       </w:r>
     </w:p>
     <w:p>
@@ -3669,6 +5993,9 @@
       </w:r>
     </w:p>
     <w:p>
+      <w:pPr>
+        <w:spacing w:after="80"/>
+      </w:pPr>
       <w:r>
         <w:rPr>
           <w:rFonts w:ascii="微软雅黑" w:hAnsi="微软雅黑" w:eastAsia="微软雅黑"/>
@@ -3676,7 +6003,7 @@
           <w:color w:val="C0392B"/>
           <w:sz w:val="20"/>
         </w:rPr>
-        <w:t>请务必在"铁路12306"APP上定好闹钟抢票，暑期跨省和短途高铁均非常抢手。</w:t>
+        <w:t>请在「铁路12306」APP定闹钟抢票。</w:t>
       </w:r>
     </w:p>
     <w:tbl>
@@ -3821,11 +6148,9 @@
                 <w:b w:val="0"/>
                 <w:sz w:val="18"/>
               </w:rPr>
-              <w:t>西安北 ⇄ 华山北 (往返)</w:t>
+              <w:t>西安北⇄华山北</w:t>
               <w:br/>
-              <w:t>去程：08:20-08:50左右车次</w:t>
-              <w:br/>
-              <w:t>返程：17:30-18:00左右车次</w:t>
+              <w:t>去08:20-08:50 返17:30-18:00</w:t>
             </w:r>
           </w:p>
         </w:tc>
@@ -3840,9 +6165,7 @@
                 <w:b w:val="0"/>
                 <w:sz w:val="18"/>
               </w:rPr>
-              <w:t>提前15天</w:t>
-              <w:br/>
-              <w:t>12:30起</w:t>
+              <w:t>提前15天12:30</w:t>
             </w:r>
           </w:p>
         </w:tc>
@@ -3857,7 +6180,7 @@
                 <w:b w:val="0"/>
                 <w:sz w:val="18"/>
               </w:rPr>
-              <w:t>铁路12306</w:t>
+              <w:t>12306</w:t>
             </w:r>
           </w:p>
         </w:tc>
@@ -3874,9 +6197,9 @@
               </w:rPr>
               <w:t>6周岁以下（不占座）免费；</w:t>
               <w:br/>
-              <w:t>6-14周岁购买儿童半价票；</w:t>
+              <w:t>6-14周岁半价；</w:t>
               <w:br/>
-              <w:t>14周岁及以上购买成人票。</w:t>
+              <w:t>14周岁及以上成人票。</w:t>
             </w:r>
           </w:p>
         </w:tc>
@@ -3908,9 +6231,9 @@
                 <w:b w:val="0"/>
                 <w:sz w:val="18"/>
               </w:rPr>
-              <w:t>西安北 → 成都东</w:t>
+              <w:t>西安北→成都东</w:t>
               <w:br/>
-              <w:t>建议车次：10:00-14:00左右车次</w:t>
+              <w:t>10:00-14:00</w:t>
             </w:r>
           </w:p>
         </w:tc>
@@ -3925,9 +6248,7 @@
                 <w:b w:val="0"/>
                 <w:sz w:val="18"/>
               </w:rPr>
-              <w:t>提前15天</w:t>
-              <w:br/>
-              <w:t>12:30起</w:t>
+              <w:t>提前15天12:30</w:t>
             </w:r>
           </w:p>
         </w:tc>
@@ -3942,7 +6263,7 @@
                 <w:b w:val="0"/>
                 <w:sz w:val="18"/>
               </w:rPr>
-              <w:t>铁路12306</w:t>
+              <w:t>12306</w:t>
             </w:r>
           </w:p>
         </w:tc>
@@ -3989,11 +6310,9 @@
                 <w:b w:val="0"/>
                 <w:sz w:val="18"/>
               </w:rPr>
-              <w:t>成都东 ⇄ 广汉北 (往返)</w:t>
+              <w:t>成都东⇄广汉北</w:t>
               <w:br/>
-              <w:t>去程：10:00-10:40左右车次</w:t>
-              <w:br/>
-              <w:t>返程：15:00-15:40左右车次</w:t>
+              <w:t>去10:00-10:40 返15:00-15:40</w:t>
             </w:r>
           </w:p>
         </w:tc>
@@ -4008,9 +6327,7 @@
                 <w:b w:val="0"/>
                 <w:sz w:val="18"/>
               </w:rPr>
-              <w:t>提前15天</w:t>
-              <w:br/>
-              <w:t>12:30起</w:t>
+              <w:t>提前15天12:30</w:t>
             </w:r>
           </w:p>
         </w:tc>
@@ -4025,7 +6342,7 @@
                 <w:b w:val="0"/>
                 <w:sz w:val="18"/>
               </w:rPr>
-              <w:t>铁路12306</w:t>
+              <w:t>12306</w:t>
             </w:r>
           </w:p>
         </w:tc>
@@ -4072,7 +6389,7 @@
                 <w:b w:val="0"/>
                 <w:sz w:val="18"/>
               </w:rPr>
-              <w:t>犀浦 → 都江堰 / 离堆公园 → 犀浦</w:t>
+              <w:t>犀浦→都江堰/离堆公园→犀浦</w:t>
             </w:r>
           </w:p>
         </w:tc>
@@ -4087,9 +6404,7 @@
                 <w:b w:val="0"/>
                 <w:sz w:val="18"/>
               </w:rPr>
-              <w:t>提前15天</w:t>
-              <w:br/>
-              <w:t>12:30起</w:t>
+              <w:t>提前15天12:30</w:t>
             </w:r>
           </w:p>
         </w:tc>
@@ -4104,7 +6419,7 @@
                 <w:b w:val="0"/>
                 <w:sz w:val="18"/>
               </w:rPr>
-              <w:t>铁路12306</w:t>
+              <w:t>12306</w:t>
             </w:r>
           </w:p>
         </w:tc>
@@ -4251,7 +6566,7 @@
                 <w:color w:val="FFFFFF"/>
                 <w:sz w:val="18"/>
               </w:rPr>
-              <w:t>票价及儿童优待政策</w:t>
+              <w:t>票价及儿童政策</w:t>
             </w:r>
           </w:p>
         </w:tc>
@@ -4289,6 +6604,8 @@
                 <w:sz w:val="18"/>
               </w:rPr>
               <w:t>秦始皇兵马俑</w:t>
+              <w:br/>
+              <w:t>（含丽山园）</w:t>
             </w:r>
           </w:p>
         </w:tc>
@@ -4318,9 +6635,9 @@
                 <w:b w:val="0"/>
                 <w:sz w:val="18"/>
               </w:rPr>
-              <w:t>提前 7 天</w:t>
+              <w:t>提前7天</w:t>
               <w:br/>
-              <w:t>（每天10:00放票）</w:t>
+              <w:t>10:00放票</w:t>
             </w:r>
           </w:p>
         </w:tc>
@@ -4335,9 +6652,7 @@
                 <w:b w:val="0"/>
                 <w:sz w:val="18"/>
               </w:rPr>
-              <w:t>微信公众号</w:t>
-              <w:br/>
-              <w:t>【秦始皇帝陵博物院】</w:t>
+              <w:t>微信【秦始皇帝陵博物院】</w:t>
             </w:r>
           </w:p>
         </w:tc>
@@ -4352,11 +6667,7 @@
                 <w:b w:val="0"/>
                 <w:sz w:val="18"/>
               </w:rPr>
-              <w:t>成人 120元/人；</w:t>
-              <w:br/>
-              <w:t>16周岁（含）以下免费。</w:t>
-              <w:br/>
-              <w:t>注：免费儿童也必须在线上录入证件号预约零元票。</w:t>
+              <w:t>成人120元；16岁及以下免费</w:t>
             </w:r>
           </w:p>
         </w:tc>
@@ -4371,7 +6682,7 @@
                 <w:b w:val="0"/>
                 <w:sz w:val="18"/>
               </w:rPr>
-              <w:t>建议预约10:00-12:00入园时段</w:t>
+              <w:t>10:00-12:00入园；两园一票制</w:t>
             </w:r>
           </w:p>
         </w:tc>
@@ -4388,9 +6699,7 @@
                 <w:b w:val="0"/>
                 <w:sz w:val="18"/>
               </w:rPr>
-              <w:t>西安博物院</w:t>
-              <w:br/>
-              <w:t>(小雁塔)</w:t>
+              <w:t>陕西历史博物馆</w:t>
             </w:r>
           </w:p>
         </w:tc>
@@ -4420,9 +6729,7 @@
                 <w:b w:val="0"/>
                 <w:sz w:val="18"/>
               </w:rPr>
-              <w:t>提前 7 天</w:t>
-              <w:br/>
-              <w:t>（每天18:00放票）</w:t>
+              <w:t>提前5-7天</w:t>
             </w:r>
           </w:p>
         </w:tc>
@@ -4437,9 +6744,7 @@
                 <w:b w:val="0"/>
                 <w:sz w:val="18"/>
               </w:rPr>
-              <w:t>微信小程序</w:t>
-              <w:br/>
-              <w:t>【西安博物院】</w:t>
+              <w:t>微信【陕西历史博物馆】</w:t>
             </w:r>
           </w:p>
         </w:tc>
@@ -4454,7 +6759,7 @@
                 <w:b w:val="0"/>
                 <w:sz w:val="18"/>
               </w:rPr>
-              <w:t>门票免费，但需实名制预约。</w:t>
+              <w:t>基本陈列免费，实名预约</w:t>
             </w:r>
           </w:p>
         </w:tc>
@@ -4469,7 +6774,7 @@
                 <w:b w:val="0"/>
                 <w:sz w:val="18"/>
               </w:rPr>
-              <w:t>暑期小雁塔限流极严，必须准时抢。</w:t>
+              <w:t>暑期极难抢！</w:t>
             </w:r>
           </w:p>
         </w:tc>
@@ -4516,9 +6821,7 @@
                 <w:b w:val="0"/>
                 <w:sz w:val="18"/>
               </w:rPr>
-              <w:t>提前 7 - 14 天</w:t>
-              <w:br/>
-              <w:t>（通常提前7天放票）</w:t>
+              <w:t>提前7-14天</w:t>
             </w:r>
           </w:p>
         </w:tc>
@@ -4533,9 +6836,7 @@
                 <w:b w:val="0"/>
                 <w:sz w:val="18"/>
               </w:rPr>
-              <w:t>微信小程序</w:t>
-              <w:br/>
-              <w:t>【成都大熊猫繁育研究基地】</w:t>
+              <w:t>微信【成都大熊猫繁育研究基地】</w:t>
             </w:r>
           </w:p>
         </w:tc>
@@ -4550,11 +6851,7 @@
                 <w:b w:val="0"/>
                 <w:sz w:val="18"/>
               </w:rPr>
-              <w:t>成人 55元/人；</w:t>
-              <w:br/>
-              <w:t>6周岁(含)以下或身高1.3米以下儿童免票（需预约免票）；</w:t>
-              <w:br/>
-              <w:t>6-18周岁购买半价学生票。</w:t>
+              <w:t>成人55元；6岁或1.3m以下免票</w:t>
             </w:r>
           </w:p>
         </w:tc>
@@ -4569,7 +6866,7 @@
                 <w:b w:val="0"/>
                 <w:sz w:val="18"/>
               </w:rPr>
-              <w:t>必须预约"上午票"。入园刷身份证原件。</w:t>
+              <w:t>必须预约上午票</w:t>
             </w:r>
           </w:p>
         </w:tc>
@@ -4586,7 +6883,7 @@
                 <w:b w:val="0"/>
                 <w:sz w:val="18"/>
               </w:rPr>
-              <w:t>金沙遗址博物馆</w:t>
+              <w:t>杜甫草堂博物馆</w:t>
             </w:r>
           </w:p>
         </w:tc>
@@ -4616,7 +6913,7 @@
                 <w:b w:val="0"/>
                 <w:sz w:val="18"/>
               </w:rPr>
-              <w:t>提前 7 天</w:t>
+              <w:t>提前3-7天</w:t>
             </w:r>
           </w:p>
         </w:tc>
@@ -4631,9 +6928,7 @@
                 <w:b w:val="0"/>
                 <w:sz w:val="18"/>
               </w:rPr>
-              <w:t>微信公众号</w:t>
-              <w:br/>
-              <w:t>【金沙遗址博物馆】</w:t>
+              <w:t>微信【杜甫草堂博物馆】</w:t>
             </w:r>
           </w:p>
         </w:tc>
@@ -4648,11 +6943,7 @@
                 <w:b w:val="0"/>
                 <w:sz w:val="18"/>
               </w:rPr>
-              <w:t>成人 70元/人；</w:t>
-              <w:br/>
-              <w:t>6周岁(含)以下或1.3米以下儿童免费；</w:t>
-              <w:br/>
-              <w:t>6-18周岁半价。</w:t>
+              <w:t>成人50元；6-18岁半价</w:t>
             </w:r>
           </w:p>
         </w:tc>
@@ -4667,7 +6958,7 @@
                 <w:b w:val="0"/>
                 <w:sz w:val="18"/>
               </w:rPr>
-              <w:t>馆内有空调，可作为避暑备用。</w:t>
+              <w:t>下午参观可避暑</w:t>
             </w:r>
           </w:p>
         </w:tc>
@@ -4714,9 +7005,9 @@
                 <w:b w:val="0"/>
                 <w:sz w:val="18"/>
               </w:rPr>
-              <w:t>提前 5 天</w:t>
+              <w:t>提前5天</w:t>
               <w:br/>
-              <w:t>（每天20:00放票）</w:t>
+              <w:t>20:00放票</w:t>
             </w:r>
           </w:p>
         </w:tc>
@@ -4731,9 +7022,7 @@
                 <w:b w:val="0"/>
                 <w:sz w:val="18"/>
               </w:rPr>
-              <w:t>微信公众号/小程序</w:t>
-              <w:br/>
-              <w:t>【三星堆博物馆】</w:t>
+              <w:t>微信【三星堆博物馆】</w:t>
             </w:r>
           </w:p>
         </w:tc>
@@ -4748,11 +7037,7 @@
                 <w:b w:val="0"/>
                 <w:sz w:val="18"/>
               </w:rPr>
-              <w:t>成人 72元/人；</w:t>
-              <w:br/>
-              <w:t>未满6岁儿童免票；</w:t>
-              <w:br/>
-              <w:t>6-18周岁购买半价学生票。</w:t>
+              <w:t>成人72元；未满6岁免票</w:t>
             </w:r>
           </w:p>
         </w:tc>
@@ -4767,7 +7052,7 @@
                 <w:b w:val="0"/>
                 <w:sz w:val="18"/>
               </w:rPr>
-              <w:t>暑期最难抢的票！务必提前在系统录入好全家人证件信息，20:00准时拼手速抢下午场（12:00-17:00）。</w:t>
+              <w:t>暑期最难抢！20:00抢下午场</w:t>
             </w:r>
           </w:p>
         </w:tc>
@@ -4814,7 +7099,7 @@
                 <w:b w:val="0"/>
                 <w:sz w:val="18"/>
               </w:rPr>
-              <w:t>提前 7 - 14 天</w:t>
+              <w:t>提前7-14天</w:t>
             </w:r>
           </w:p>
         </w:tc>
@@ -4829,9 +7114,7 @@
                 <w:b w:val="0"/>
                 <w:sz w:val="18"/>
               </w:rPr>
-              <w:t>微信公众号</w:t>
-              <w:br/>
-              <w:t>【熊猫谷】</w:t>
+              <w:t>微信【熊猫谷】</w:t>
             </w:r>
           </w:p>
         </w:tc>
@@ -4846,11 +7129,7 @@
                 <w:b w:val="0"/>
                 <w:sz w:val="18"/>
               </w:rPr>
-              <w:t>成人 55元/人；</w:t>
-              <w:br/>
-              <w:t>6周岁及以下儿童免票；</w:t>
-              <w:br/>
-              <w:t>6-18周岁半价。</w:t>
+              <w:t>成人55元；6岁及以下免票</w:t>
             </w:r>
           </w:p>
         </w:tc>
@@ -4865,7 +7144,7 @@
                 <w:b w:val="0"/>
                 <w:sz w:val="18"/>
               </w:rPr>
-              <w:t>限流严格。若要看红熊猫，入园后需在"红熊猫放养区"入口再次排队。</w:t>
+              <w:t>红熊猫放养区二次排队</w:t>
             </w:r>
           </w:p>
         </w:tc>
@@ -4912,7 +7191,7 @@
                 <w:b w:val="0"/>
                 <w:sz w:val="18"/>
               </w:rPr>
-              <w:t>提前 7 天内均可</w:t>
+              <w:t>提前7天内</w:t>
             </w:r>
           </w:p>
         </w:tc>
@@ -4927,9 +7206,7 @@
                 <w:b w:val="0"/>
                 <w:sz w:val="18"/>
               </w:rPr>
-              <w:t>微信公众号</w:t>
-              <w:br/>
-              <w:t>【青城山都江堰】</w:t>
+              <w:t>微信【青城山都江堰】</w:t>
             </w:r>
           </w:p>
         </w:tc>
@@ -4944,11 +7221,7 @@
                 <w:b w:val="0"/>
                 <w:sz w:val="18"/>
               </w:rPr>
-              <w:t>成人 80元/人；</w:t>
-              <w:br/>
-              <w:t>14周岁以下儿童免票；</w:t>
-              <w:br/>
-              <w:t>14-18周岁半价。</w:t>
+              <w:t>成人80元；14岁以下免票</w:t>
             </w:r>
           </w:p>
         </w:tc>
@@ -4963,7 +7236,7 @@
                 <w:b w:val="0"/>
                 <w:sz w:val="18"/>
               </w:rPr>
-              <w:t>建议从秦堰楼（6号门）进，顺坡下行省力。</w:t>
+              <w:t>秦堰楼6号门进</w:t>
             </w:r>
           </w:p>
         </w:tc>
@@ -5054,7 +7327,7 @@
                 <w:color w:val="FFFFFF"/>
                 <w:sz w:val="18"/>
               </w:rPr>
-              <w:t>建议预约/抢票时间</w:t>
+              <w:t>建议预约时间</w:t>
             </w:r>
           </w:p>
         </w:tc>
@@ -5141,7 +7414,7 @@
                 <w:b w:val="0"/>
                 <w:sz w:val="18"/>
               </w:rPr>
-              <w:t>提前 7 - 10 天</w:t>
+              <w:t>提前7-10天</w:t>
             </w:r>
           </w:p>
         </w:tc>
@@ -5156,7 +7429,7 @@
                 <w:b w:val="0"/>
                 <w:sz w:val="18"/>
               </w:rPr>
-              <w:t>携程/美团/官方小程序</w:t>
+              <w:t>携程/美团</w:t>
             </w:r>
           </w:p>
         </w:tc>
@@ -5171,7 +7444,7 @@
                 <w:b w:val="0"/>
                 <w:sz w:val="18"/>
               </w:rPr>
-              <w:t>建议选择下午 18:00左右 的场次，票务一般含世博园入园。</w:t>
+              <w:t>18:00场次，含世博园</w:t>
             </w:r>
           </w:p>
         </w:tc>
@@ -5218,7 +7491,7 @@
                 <w:b w:val="0"/>
                 <w:sz w:val="18"/>
               </w:rPr>
-              <w:t>提前 3 - 5 天</w:t>
+              <w:t>提前3-5天</w:t>
             </w:r>
           </w:p>
         </w:tc>
@@ -5233,7 +7506,7 @@
                 <w:b w:val="0"/>
                 <w:sz w:val="18"/>
               </w:rPr>
-              <w:t>微信公众号【华山景区】</w:t>
+              <w:t>微信【华山景区】</w:t>
             </w:r>
           </w:p>
         </w:tc>
@@ -5248,7 +7521,7 @@
                 <w:b w:val="0"/>
                 <w:sz w:val="18"/>
               </w:rPr>
-              <w:t>必须购买"西峰索道上+西峰索道下（西上西下）"的套票（含华山门票+双向进山车票+双向索道票）。</w:t>
+              <w:t>西上西下套票</w:t>
             </w:r>
           </w:p>
         </w:tc>
@@ -5295,7 +7568,7 @@
                 <w:b w:val="0"/>
                 <w:sz w:val="18"/>
               </w:rPr>
-              <w:t>提前 1 - 2 天</w:t>
+              <w:t>提前1-2天</w:t>
             </w:r>
           </w:p>
         </w:tc>
@@ -5310,7 +7583,7 @@
                 <w:b w:val="0"/>
                 <w:sz w:val="18"/>
               </w:rPr>
-              <w:t>微信小程序【大唐芙蓉园】</w:t>
+              <w:t>微信【大唐芙蓉园】</w:t>
             </w:r>
           </w:p>
         </w:tc>
@@ -5325,7 +7598,7 @@
                 <w:b w:val="0"/>
                 <w:sz w:val="18"/>
               </w:rPr>
-              <w:t>购买包含门票+芙蓉湖画舫游船的套票（画舫配有冷气）。</w:t>
+              <w:t>门票+画舫套票</w:t>
             </w:r>
           </w:p>
         </w:tc>
@@ -5372,7 +7645,7 @@
                 <w:b w:val="0"/>
                 <w:sz w:val="18"/>
               </w:rPr>
-              <w:t>无需提前，现场购买</w:t>
+              <w:t>现场购买</w:t>
             </w:r>
           </w:p>
         </w:tc>
@@ -5387,7 +7660,7 @@
                 <w:b w:val="0"/>
                 <w:sz w:val="18"/>
               </w:rPr>
-              <w:t>永宁门（南门）现场车票点</w:t>
+              <w:t>永宁门</w:t>
             </w:r>
           </w:p>
         </w:tc>
@@ -5402,7 +7675,7 @@
                 <w:b w:val="0"/>
                 <w:sz w:val="18"/>
               </w:rPr>
-              <w:t>现场购买单站票或景区半圈/整圈电瓶车票，代替儿童骑行。</w:t>
+              <w:t>代替儿童骑行</w:t>
             </w:r>
           </w:p>
         </w:tc>
@@ -5419,7 +7692,7 @@
                 <w:b w:val="0"/>
                 <w:sz w:val="18"/>
               </w:rPr>
-              <w:t>夜游锦江（船票）</w:t>
+              <w:t>夜游锦江</w:t>
             </w:r>
           </w:p>
         </w:tc>
@@ -5449,7 +7722,7 @@
                 <w:b w:val="0"/>
                 <w:sz w:val="18"/>
               </w:rPr>
-              <w:t>提前 5 - 7 天</w:t>
+              <w:t>提前5-7天</w:t>
             </w:r>
           </w:p>
         </w:tc>
@@ -5464,7 +7737,7 @@
                 <w:b w:val="0"/>
                 <w:sz w:val="18"/>
               </w:rPr>
-              <w:t>微信小程序【夜游锦江】</w:t>
+              <w:t>微信【夜游锦江】</w:t>
             </w:r>
           </w:p>
         </w:tc>
@@ -5479,7 +7752,7 @@
                 <w:b w:val="0"/>
                 <w:sz w:val="18"/>
               </w:rPr>
-              <w:t>购买"东门码头"出发的游船票。暑期夜间船票极紧俏，需提前锁定。</w:t>
+              <w:t>东门码头出发</w:t>
             </w:r>
           </w:p>
         </w:tc>
@@ -5496,7 +7769,7 @@
                 <w:b w:val="0"/>
                 <w:sz w:val="18"/>
               </w:rPr>
-              <w:t>《花重锦官城》大秀</w:t>
+              <w:t>《花重锦官城》</w:t>
             </w:r>
           </w:p>
         </w:tc>
@@ -5526,7 +7799,7 @@
                 <w:b w:val="0"/>
                 <w:sz w:val="18"/>
               </w:rPr>
-              <w:t>提前 5 天</w:t>
+              <w:t>提前5天</w:t>
             </w:r>
           </w:p>
         </w:tc>
@@ -5541,7 +7814,7 @@
                 <w:b w:val="0"/>
                 <w:sz w:val="18"/>
               </w:rPr>
-              <w:t>携程/美团/官方小程序</w:t>
+              <w:t>携程/美团</w:t>
             </w:r>
           </w:p>
         </w:tc>
@@ -5556,7 +7829,7 @@
                 <w:b w:val="0"/>
                 <w:sz w:val="18"/>
               </w:rPr>
-              <w:t>演出在文殊坊妙剧场。建议选择晚上 20:00 左右 的场次。</w:t>
+              <w:t>妙剧场20:00场次</w:t>
             </w:r>
           </w:p>
         </w:tc>

</xml_diff>